<commit_message>
Added Google Search Console verification meta tag
</commit_message>
<xml_diff>
--- a/src/assets/CV/Arumemi_Michelle_Webdev_CV.docx
+++ b/src/assets/CV/Arumemi_Michelle_Webdev_CV.docx
@@ -41,25 +41,43 @@
         <w:rPr>
           <w:rFonts w:cstheme="minorHAnsi"/>
         </w:rPr>
-        <w:t>+234 8102829322</w:t>
-      </w:r>
-      <w:r>
-        <w:rPr>
-          <w:rFonts w:cstheme="minorHAnsi"/>
-        </w:rPr>
-        <w:t xml:space="preserve">  | </w:t>
-      </w:r>
-      <w:r>
-        <w:rPr>
-          <w:rFonts w:cstheme="minorHAnsi"/>
-        </w:rPr>
-        <w:t>Abuja, Nigeria</w:t>
-      </w:r>
-      <w:r>
-        <w:rPr>
-          <w:rFonts w:cstheme="minorHAnsi"/>
-        </w:rPr>
-        <w:t xml:space="preserve"> | </w:t>
+        <w:t>+234</w:t>
+      </w:r>
+      <w:r>
+        <w:rPr>
+          <w:rFonts w:cstheme="minorHAnsi"/>
+        </w:rPr>
+        <w:t>-</w:t>
+      </w:r>
+      <w:r>
+        <w:rPr>
+          <w:rFonts w:cstheme="minorHAnsi"/>
+        </w:rPr>
+        <w:t xml:space="preserve">8102829322 | </w:t>
+      </w:r>
+      <w:r>
+        <w:rPr>
+          <w:rFonts w:cstheme="minorHAnsi"/>
+        </w:rPr>
+        <w:t>FCT, Abuja</w:t>
+      </w:r>
+      <w:r>
+        <w:rPr>
+          <w:rFonts w:cstheme="minorHAnsi"/>
+        </w:rPr>
+        <w:t>,</w:t>
+      </w:r>
+      <w:r>
+        <w:rPr>
+          <w:rFonts w:cstheme="minorHAnsi"/>
+        </w:rPr>
+        <w:t xml:space="preserve"> Nigeria </w:t>
+      </w:r>
+      <w:r>
+        <w:rPr>
+          <w:rFonts w:cstheme="minorHAnsi"/>
+        </w:rPr>
+        <w:t xml:space="preserve">| </w:t>
       </w:r>
       <w:hyperlink r:id="rId7" w:history="1">
         <w:r>
@@ -89,6 +107,7 @@
         <w:t xml:space="preserve"> </w:t>
       </w:r>
       <w:hyperlink r:id="rId8" w:history="1">
+        <w:proofErr w:type="spellStart"/>
         <w:r>
           <w:rPr>
             <w:rStyle w:val="Hyperlink"/>
@@ -96,6 +115,7 @@
           </w:rPr>
           <w:t>Github</w:t>
         </w:r>
+        <w:proofErr w:type="spellEnd"/>
       </w:hyperlink>
       <w:r>
         <w:rPr>
@@ -109,21 +129,7 @@
             <w:rStyle w:val="Hyperlink"/>
             <w:rFonts w:cstheme="minorHAnsi"/>
           </w:rPr>
-          <w:t>Linke</w:t>
-        </w:r>
-        <w:r>
-          <w:rPr>
-            <w:rStyle w:val="Hyperlink"/>
-            <w:rFonts w:cstheme="minorHAnsi"/>
-          </w:rPr>
-          <w:t>d</w:t>
-        </w:r>
-        <w:r>
-          <w:rPr>
-            <w:rStyle w:val="Hyperlink"/>
-            <w:rFonts w:cstheme="minorHAnsi"/>
-          </w:rPr>
-          <w:t>In</w:t>
+          <w:t>LinkedIn</w:t>
         </w:r>
       </w:hyperlink>
       <w:r>
@@ -146,7 +152,7 @@
           <w:rFonts w:cstheme="minorHAnsi"/>
         </w:rPr>
         <w:pict w14:anchorId="5023F592">
-          <v:rect id="_x0000_i1259" style="width:0;height:1.5pt" o:hralign="center" o:hrstd="t" o:hr="t" fillcolor="#a0a0a0" stroked="f"/>
+          <v:rect id="_x0000_i1025" style="width:0;height:1.5pt" o:hralign="center" o:hrstd="t" o:hr="t" fillcolor="#a0a0a0" stroked="f"/>
         </w:pict>
       </w:r>
     </w:p>
@@ -182,74 +188,46 @@
       <w:r>
         <w:rPr>
           <w:rFonts w:cstheme="minorHAnsi"/>
-          <w:i/>
-          <w:iCs/>
-        </w:rPr>
-        <w:t>Frontend Developer with over 3 years of experience in creating responsive, SEO-optimized web</w:t>
-      </w:r>
-      <w:r>
-        <w:rPr>
-          <w:rFonts w:cstheme="minorHAnsi"/>
-          <w:i/>
-          <w:iCs/>
+        </w:rPr>
+        <w:t>Full-Stack Developer with 4+ years of experience building responsive, SEO-optimized web</w:t>
+      </w:r>
+      <w:r>
+        <w:rPr>
+          <w:rFonts w:cstheme="minorHAnsi"/>
         </w:rPr>
         <w:t xml:space="preserve"> </w:t>
       </w:r>
       <w:r>
         <w:rPr>
           <w:rFonts w:cstheme="minorHAnsi"/>
-          <w:i/>
-          <w:iCs/>
-        </w:rPr>
-        <w:t>interfaces. Expert in HTML, CSS,</w:t>
-      </w:r>
-      <w:r>
-        <w:rPr>
-          <w:rFonts w:cstheme="minorHAnsi"/>
-          <w:i/>
-          <w:iCs/>
+        </w:rPr>
+        <w:t>applications. Proficient in HTML5, CSS3, JavaScript ES6+, jQuery, TypeScript, React, Next.js,</w:t>
+      </w:r>
+      <w:r>
+        <w:rPr>
+          <w:rFonts w:cstheme="minorHAnsi"/>
         </w:rPr>
         <w:t xml:space="preserve"> </w:t>
       </w:r>
-      <w:r>
-        <w:rPr>
-          <w:rFonts w:cstheme="minorHAnsi"/>
-          <w:i/>
-          <w:iCs/>
-        </w:rPr>
-        <w:t xml:space="preserve">JavaScript, </w:t>
-      </w:r>
-      <w:r>
-        <w:rPr>
-          <w:rFonts w:cstheme="minorHAnsi"/>
-          <w:i/>
-          <w:iCs/>
-        </w:rPr>
-        <w:t>React</w:t>
-      </w:r>
-      <w:r>
-        <w:rPr>
-          <w:rFonts w:cstheme="minorHAnsi"/>
-          <w:i/>
-          <w:iCs/>
-        </w:rPr>
-        <w:t>, Express.js</w:t>
-      </w:r>
-      <w:r>
-        <w:rPr>
-          <w:rFonts w:cstheme="minorHAnsi"/>
-          <w:i/>
-          <w:iCs/>
-        </w:rPr>
-        <w:t xml:space="preserve">, Node.Js, MongoDb, </w:t>
-      </w:r>
-      <w:r>
-        <w:rPr>
-          <w:rFonts w:cstheme="minorHAnsi"/>
-          <w:i/>
-          <w:iCs/>
-        </w:rPr>
-        <w:t>excels in translating Figma designs into pixel-perfect layouts.</w:t>
+      <w:proofErr w:type="spellStart"/>
+      <w:r>
+        <w:rPr>
+          <w:rFonts w:cstheme="minorHAnsi"/>
+        </w:rPr>
+        <w:t>NestJs</w:t>
+      </w:r>
+      <w:proofErr w:type="spellEnd"/>
+      <w:r>
+        <w:rPr>
+          <w:rFonts w:cstheme="minorHAnsi"/>
+        </w:rPr>
+        <w:t>,</w:t>
+      </w:r>
+      <w:r>
+        <w:rPr>
+          <w:rFonts w:cstheme="minorHAnsi"/>
+        </w:rPr>
+        <w:t xml:space="preserve"> Vue, and Bootstrap for frontend development, with strong backend expertise in Node.js, Express.js, PHP, MySQL, and MongoDB. Experienced in translating Figma and PSD designs into pixel-perfect, cross-browser compatible interfaces using media queries and responsive design principles. Skilled in WordPress theme and plugin development, with hands-on experience on Shopify, BigCommerce, and Magento platforms. Proficient with Git/SVN version control, Chrome DevTools debugging, and AI-assisted development tools including GitHub Copilot and Cursor. Adept at managing multiple projects under tight deadlines with strong attention to detail and clear communication.</w:t>
       </w:r>
       <w:r>
         <w:rPr>
@@ -257,31 +235,25 @@
         </w:rPr>
         <w:t xml:space="preserve"> </w:t>
       </w:r>
+      <w:r>
+        <w:rPr>
+          <w:rFonts w:cstheme="minorHAnsi"/>
+          <w:color w:val="FFFFFF" w:themeColor="background1"/>
+        </w:rPr>
+        <w:t>Full stack</w:t>
+      </w:r>
+      <w:r>
+        <w:rPr>
+          <w:rFonts w:cstheme="minorHAnsi"/>
+        </w:rPr>
+        <w:pict w14:anchorId="18351AFB">
+          <v:rect id="_x0000_i1026" style="width:0;height:1.5pt" o:hralign="center" o:hrstd="t" o:hr="t" fillcolor="#a0a0a0" stroked="f"/>
+        </w:pict>
+      </w:r>
     </w:p>
     <w:p>
       <w:pPr>
         <w:ind w:left="90" w:hanging="90"/>
-        <w:rPr>
-          <w:rFonts w:cstheme="minorHAnsi"/>
-        </w:rPr>
-      </w:pPr>
-      <w:r>
-        <w:rPr>
-          <w:rFonts w:cstheme="minorHAnsi"/>
-        </w:rPr>
-        <w:pict w14:anchorId="18351AFB">
-          <v:rect id="_x0000_i1261" style="width:0;height:1.5pt" o:hralign="center" o:hrstd="t" o:hr="t" fillcolor="#a0a0a0" stroked="f"/>
-        </w:pict>
-      </w:r>
-    </w:p>
-    <w:p>
-      <w:pPr>
-        <w:ind w:left="90" w:hanging="90"/>
-        <w:rPr>
-          <w:rFonts w:cstheme="minorHAnsi"/>
-        </w:rPr>
-      </w:pPr>
-      <w:r>
         <w:rPr>
           <w:rFonts w:cstheme="minorHAnsi"/>
           <w:b/>
@@ -289,198 +261,8 @@
           <w:sz w:val="28"/>
           <w:szCs w:val="28"/>
         </w:rPr>
-        <w:t>CORE COMPETENCIES</w:t>
-      </w:r>
-      <w:r>
-        <w:rPr>
-          <w:rFonts w:cstheme="minorHAnsi"/>
-        </w:rPr>
-        <w:t xml:space="preserve"> </w:t>
-      </w:r>
-    </w:p>
-    <w:p>
-      <w:pPr>
-        <w:ind w:left="90"/>
-        <w:rPr>
-          <w:rFonts w:cstheme="minorHAnsi"/>
-        </w:rPr>
-      </w:pPr>
-      <w:r>
-        <w:rPr>
-          <w:rFonts w:cstheme="minorHAnsi"/>
-        </w:rPr>
-        <w:t>Responsive Web Design | SEO Optimization | Cross-browser Compatibility | Performance</w:t>
-      </w:r>
-      <w:r>
-        <w:rPr>
-          <w:rFonts w:cstheme="minorHAnsi"/>
-        </w:rPr>
-        <w:t xml:space="preserve"> </w:t>
-      </w:r>
-      <w:r>
-        <w:rPr>
-          <w:rFonts w:cstheme="minorHAnsi"/>
-        </w:rPr>
-        <w:t>Tuning</w:t>
-      </w:r>
-      <w:r>
-        <w:rPr>
-          <w:rFonts w:cstheme="minorHAnsi"/>
-        </w:rPr>
-        <w:t>.</w:t>
-      </w:r>
-    </w:p>
-    <w:p>
-      <w:pPr>
-        <w:ind w:left="90" w:hanging="90"/>
-        <w:rPr>
-          <w:rFonts w:cstheme="minorHAnsi"/>
-        </w:rPr>
-      </w:pPr>
-      <w:r>
-        <w:rPr>
-          <w:rFonts w:cstheme="minorHAnsi"/>
-        </w:rPr>
-        <w:pict w14:anchorId="507098ED">
-          <v:rect id="_x0000_i1262" style="width:0;height:1.5pt" o:hralign="center" o:hrstd="t" o:hr="t" fillcolor="#a0a0a0" stroked="f"/>
-        </w:pict>
-      </w:r>
-    </w:p>
-    <w:p>
-      <w:pPr>
-        <w:ind w:left="90" w:hanging="90"/>
-        <w:rPr>
-          <w:rFonts w:cstheme="minorHAnsi"/>
-          <w:b/>
-          <w:bCs/>
-        </w:rPr>
-      </w:pPr>
-      <w:r>
-        <w:rPr>
-          <w:rFonts w:cstheme="minorHAnsi"/>
-          <w:b/>
-          <w:bCs/>
-        </w:rPr>
-        <w:t xml:space="preserve">TECHNICAL </w:t>
-      </w:r>
-      <w:r>
-        <w:rPr>
-          <w:rFonts w:cstheme="minorHAnsi"/>
-          <w:b/>
-          <w:bCs/>
-        </w:rPr>
-        <w:t>SKILLS</w:t>
-      </w:r>
-    </w:p>
-    <w:p>
-      <w:pPr>
-        <w:ind w:left="90" w:hanging="90"/>
-        <w:rPr>
-          <w:rFonts w:cstheme="minorHAnsi"/>
-        </w:rPr>
-      </w:pPr>
-      <w:r>
-        <w:rPr>
-          <w:rFonts w:cstheme="minorHAnsi"/>
-        </w:rPr>
-        <w:t>Scripting Languages: HTML, CSS</w:t>
-      </w:r>
-    </w:p>
-    <w:p>
-      <w:pPr>
-        <w:ind w:left="90" w:hanging="90"/>
-        <w:rPr>
-          <w:rFonts w:cstheme="minorHAnsi"/>
-        </w:rPr>
-      </w:pPr>
-      <w:r>
-        <w:rPr>
-          <w:rFonts w:cstheme="minorHAnsi"/>
-        </w:rPr>
-        <w:t>Programming Languages: Javascript</w:t>
-      </w:r>
-    </w:p>
-    <w:p>
-      <w:pPr>
-        <w:ind w:left="90" w:hanging="90"/>
-        <w:rPr>
-          <w:rFonts w:cstheme="minorHAnsi"/>
-        </w:rPr>
-      </w:pPr>
-      <w:r>
-        <w:rPr>
-          <w:rFonts w:cstheme="minorHAnsi"/>
-        </w:rPr>
-        <w:t>Web Development Frameworks: React.js, Node.js</w:t>
-      </w:r>
-    </w:p>
-    <w:p>
-      <w:pPr>
-        <w:ind w:left="90" w:hanging="90"/>
-        <w:rPr>
-          <w:rFonts w:cstheme="minorHAnsi"/>
-        </w:rPr>
-      </w:pPr>
-      <w:r>
-        <w:rPr>
-          <w:rFonts w:cstheme="minorHAnsi"/>
-        </w:rPr>
-        <w:t>Developer Tools: Github, VS Code, Postman</w:t>
-      </w:r>
-    </w:p>
-    <w:p>
-      <w:pPr>
-        <w:ind w:left="90" w:hanging="90"/>
-        <w:rPr>
-          <w:rFonts w:cstheme="minorHAnsi"/>
-        </w:rPr>
-      </w:pPr>
-      <w:r>
-        <w:rPr>
-          <w:rFonts w:cstheme="minorHAnsi"/>
-        </w:rPr>
-        <w:t xml:space="preserve">Design and UI Tools: Figma, Tailwind </w:t>
-      </w:r>
-      <w:r>
-        <w:rPr>
-          <w:rFonts w:cstheme="minorHAnsi"/>
-        </w:rPr>
-        <w:t>CSS</w:t>
-      </w:r>
-    </w:p>
-    <w:p>
-      <w:pPr>
-        <w:ind w:left="90" w:hanging="90"/>
-        <w:rPr>
-          <w:rFonts w:cstheme="minorHAnsi"/>
-        </w:rPr>
-      </w:pPr>
-      <w:r>
-        <w:rPr>
-          <w:rFonts w:cstheme="minorHAnsi"/>
-        </w:rPr>
-        <w:t>ORM and Database: MongoDb</w:t>
-      </w:r>
-    </w:p>
-    <w:p>
-      <w:pPr>
-        <w:ind w:left="90" w:hanging="90"/>
-        <w:rPr>
-          <w:rFonts w:cstheme="minorHAnsi"/>
-        </w:rPr>
-      </w:pPr>
-      <w:r>
-        <w:rPr>
-          <w:rFonts w:cstheme="minorHAnsi"/>
-        </w:rPr>
-        <w:pict w14:anchorId="07E1956C">
-          <v:rect id="_x0000_i1263" style="width:0;height:1.5pt" o:hralign="center" o:hrstd="t" o:hr="t" fillcolor="#a0a0a0" stroked="f"/>
-        </w:pict>
-      </w:r>
-    </w:p>
-    <w:p>
-      <w:pPr>
-        <w:ind w:left="90" w:hanging="90"/>
+      </w:pPr>
+      <w:r>
         <w:rPr>
           <w:rFonts w:cstheme="minorHAnsi"/>
           <w:b/>
@@ -488,7 +270,8 @@
           <w:sz w:val="28"/>
           <w:szCs w:val="28"/>
         </w:rPr>
-      </w:pPr>
+        <w:t xml:space="preserve">WORK </w:t>
+      </w:r>
       <w:r>
         <w:rPr>
           <w:rFonts w:cstheme="minorHAnsi"/>
@@ -498,6 +281,24 @@
           <w:szCs w:val="28"/>
         </w:rPr>
         <w:t>EXPERIENCE</w:t>
+      </w:r>
+    </w:p>
+    <w:p>
+      <w:pPr>
+        <w:ind w:left="90" w:hanging="90"/>
+        <w:rPr>
+          <w:rFonts w:cstheme="minorHAnsi"/>
+          <w:b/>
+          <w:bCs/>
+        </w:rPr>
+      </w:pPr>
+      <w:r>
+        <w:rPr>
+          <w:rFonts w:cstheme="minorHAnsi"/>
+          <w:b/>
+          <w:bCs/>
+        </w:rPr>
+        <w:t>Freelance Full Stack Developer | Self-employed | 2021–Present</w:t>
       </w:r>
     </w:p>
     <w:p>
@@ -543,7 +344,97 @@
           <w:szCs w:val="22"/>
           <w14:ligatures w14:val="none"/>
         </w:rPr>
-        <w:t>Developed 4+ responsive websites for clients using React, HTML, CSS, and JavaScript</w:t>
+        <w:t xml:space="preserve">Developed </w:t>
+      </w:r>
+      <w:r>
+        <w:rPr>
+          <w:rFonts w:eastAsia="Times New Roman" w:cstheme="minorHAnsi"/>
+          <w:kern w:val="0"/>
+          <w:sz w:val="22"/>
+          <w:szCs w:val="22"/>
+          <w14:ligatures w14:val="none"/>
+        </w:rPr>
+        <w:t>30</w:t>
+      </w:r>
+      <w:r>
+        <w:rPr>
+          <w:rFonts w:eastAsia="Times New Roman" w:cstheme="minorHAnsi"/>
+          <w:kern w:val="0"/>
+          <w:sz w:val="22"/>
+          <w:szCs w:val="22"/>
+          <w14:ligatures w14:val="none"/>
+        </w:rPr>
+        <w:t>+ responsive websites</w:t>
+      </w:r>
+      <w:r>
+        <w:rPr>
+          <w:rFonts w:eastAsia="Times New Roman" w:cstheme="minorHAnsi"/>
+          <w:kern w:val="0"/>
+          <w:sz w:val="22"/>
+          <w:szCs w:val="22"/>
+          <w14:ligatures w14:val="none"/>
+        </w:rPr>
+        <w:t xml:space="preserve"> </w:t>
+      </w:r>
+      <w:r>
+        <w:rPr>
+          <w:rFonts w:eastAsia="Times New Roman" w:cstheme="minorHAnsi"/>
+          <w:kern w:val="0"/>
+          <w:sz w:val="22"/>
+          <w:szCs w:val="22"/>
+          <w14:ligatures w14:val="none"/>
+        </w:rPr>
+        <w:t>using React, HTML</w:t>
+      </w:r>
+      <w:r>
+        <w:rPr>
+          <w:rFonts w:eastAsia="Times New Roman" w:cstheme="minorHAnsi"/>
+          <w:kern w:val="0"/>
+          <w:sz w:val="22"/>
+          <w:szCs w:val="22"/>
+          <w14:ligatures w14:val="none"/>
+        </w:rPr>
+        <w:t>5</w:t>
+      </w:r>
+      <w:r>
+        <w:rPr>
+          <w:rFonts w:eastAsia="Times New Roman" w:cstheme="minorHAnsi"/>
+          <w:kern w:val="0"/>
+          <w:sz w:val="22"/>
+          <w:szCs w:val="22"/>
+          <w14:ligatures w14:val="none"/>
+        </w:rPr>
+        <w:t>, CSS</w:t>
+      </w:r>
+      <w:r>
+        <w:rPr>
+          <w:rFonts w:eastAsia="Times New Roman" w:cstheme="minorHAnsi"/>
+          <w:kern w:val="0"/>
+          <w:sz w:val="22"/>
+          <w:szCs w:val="22"/>
+          <w14:ligatures w14:val="none"/>
+        </w:rPr>
+        <w:t>3</w:t>
+      </w:r>
+      <w:r>
+        <w:rPr>
+          <w:rFonts w:eastAsia="Times New Roman" w:cstheme="minorHAnsi"/>
+          <w:kern w:val="0"/>
+          <w:sz w:val="22"/>
+          <w:szCs w:val="22"/>
+          <w14:ligatures w14:val="none"/>
+        </w:rPr>
+        <w:t>, and JavaScript</w:t>
+      </w:r>
+      <w:r>
+        <w:rPr>
+          <w:rFonts w:eastAsia="Times New Roman" w:cstheme="minorHAnsi"/>
+          <w:kern w:val="0"/>
+          <w:sz w:val="22"/>
+          <w:szCs w:val="22"/>
+          <w14:ligatures w14:val="none"/>
+        </w:rPr>
+        <w:t>.</w:t>
       </w:r>
     </w:p>
     <w:p>
@@ -567,7 +458,31 @@
           <w:sz w:val="22"/>
           <w:szCs w:val="22"/>
         </w:rPr>
-        <w:t>Collaborated with designers to translate Figma mockups into pixel-perfect layouts</w:t>
+        <w:t>Collaborated with designers to translate Figma</w:t>
+      </w:r>
+      <w:r>
+        <w:rPr>
+          <w:rFonts w:asciiTheme="minorHAnsi" w:hAnsiTheme="minorHAnsi" w:cstheme="minorHAnsi"/>
+          <w:sz w:val="22"/>
+          <w:szCs w:val="22"/>
+        </w:rPr>
+        <w:t>/PSD</w:t>
+      </w:r>
+      <w:r>
+        <w:rPr>
+          <w:rFonts w:asciiTheme="minorHAnsi" w:hAnsiTheme="minorHAnsi" w:cstheme="minorHAnsi"/>
+          <w:sz w:val="22"/>
+          <w:szCs w:val="22"/>
+        </w:rPr>
+        <w:t xml:space="preserve"> mockups into pixel-perfect layouts</w:t>
+      </w:r>
+      <w:r>
+        <w:rPr>
+          <w:rFonts w:asciiTheme="minorHAnsi" w:hAnsiTheme="minorHAnsi" w:cstheme="minorHAnsi"/>
+          <w:sz w:val="22"/>
+          <w:szCs w:val="22"/>
+        </w:rPr>
+        <w:t>.</w:t>
       </w:r>
     </w:p>
     <w:p>
@@ -593,6 +508,14 @@
         </w:rPr>
         <w:t>Implemented SEO strategies resulting in improved search visibility for client sites</w:t>
       </w:r>
+      <w:r>
+        <w:rPr>
+          <w:rFonts w:asciiTheme="minorHAnsi" w:hAnsiTheme="minorHAnsi" w:cstheme="minorHAnsi"/>
+          <w:sz w:val="22"/>
+          <w:szCs w:val="22"/>
+        </w:rPr>
+        <w:t>.</w:t>
+      </w:r>
     </w:p>
     <w:p>
       <w:pPr>
@@ -615,35 +538,93 @@
           <w:sz w:val="22"/>
           <w:szCs w:val="22"/>
         </w:rPr>
-        <w:t>Deployed and maintained projects on Vercel and GitHub Pages</w:t>
-      </w:r>
-    </w:p>
-    <w:p>
-      <w:pPr>
-        <w:pStyle w:val="margin-bottom-xs"/>
-        <w:spacing w:before="0" w:beforeAutospacing="0" w:after="60" w:afterAutospacing="0" w:line="286" w:lineRule="atLeast"/>
-        <w:ind w:left="90" w:hanging="90"/>
-        <w:textAlignment w:val="baseline"/>
+        <w:t xml:space="preserve">Deployed and maintained projects on </w:t>
+      </w:r>
+      <w:proofErr w:type="spellStart"/>
+      <w:r>
         <w:rPr>
           <w:rFonts w:asciiTheme="minorHAnsi" w:hAnsiTheme="minorHAnsi" w:cstheme="minorHAnsi"/>
           <w:sz w:val="22"/>
           <w:szCs w:val="22"/>
         </w:rPr>
-      </w:pPr>
+        <w:t>Vercel</w:t>
+      </w:r>
+      <w:proofErr w:type="spellEnd"/>
       <w:r>
         <w:rPr>
           <w:rFonts w:asciiTheme="minorHAnsi" w:hAnsiTheme="minorHAnsi" w:cstheme="minorHAnsi"/>
           <w:sz w:val="22"/>
           <w:szCs w:val="22"/>
         </w:rPr>
-        <w:pict w14:anchorId="183D009B">
-          <v:rect id="_x0000_i1287" style="width:0;height:1.5pt" o:hralign="center" o:hrstd="t" o:hr="t" fillcolor="#a0a0a0" stroked="f"/>
+        <w:t xml:space="preserve"> &amp; Netlify.</w:t>
+      </w:r>
+    </w:p>
+    <w:p>
+      <w:pPr>
+        <w:pStyle w:val="HTMLPreformatted"/>
+        <w:numPr>
+          <w:ilvl w:val="0"/>
+          <w:numId w:val="1"/>
+        </w:numPr>
+        <w:wordWrap w:val="0"/>
+        <w:spacing w:line="360" w:lineRule="auto"/>
+        <w:rPr>
+          <w:rFonts w:asciiTheme="minorHAnsi" w:hAnsiTheme="minorHAnsi" w:cstheme="minorHAnsi"/>
+          <w:sz w:val="22"/>
+          <w:szCs w:val="22"/>
+        </w:rPr>
+      </w:pPr>
+      <w:r>
+        <w:rPr>
+          <w:rFonts w:asciiTheme="minorHAnsi" w:hAnsiTheme="minorHAnsi" w:cstheme="minorHAnsi"/>
+          <w:sz w:val="22"/>
+          <w:szCs w:val="22"/>
+        </w:rPr>
+        <w:t>Ensured cross-browser compatibility and mobile responsiveness.</w:t>
+      </w:r>
+    </w:p>
+    <w:p>
+      <w:pPr>
+        <w:pStyle w:val="HTMLPreformatted"/>
+        <w:numPr>
+          <w:ilvl w:val="0"/>
+          <w:numId w:val="1"/>
+        </w:numPr>
+        <w:wordWrap w:val="0"/>
+        <w:spacing w:line="360" w:lineRule="auto"/>
+        <w:rPr>
+          <w:rFonts w:asciiTheme="minorHAnsi" w:hAnsiTheme="minorHAnsi" w:cstheme="minorHAnsi"/>
+          <w:sz w:val="22"/>
+          <w:szCs w:val="22"/>
+        </w:rPr>
+      </w:pPr>
+      <w:r>
+        <w:rPr>
+          <w:rFonts w:asciiTheme="minorHAnsi" w:hAnsiTheme="minorHAnsi" w:cstheme="minorHAnsi"/>
+          <w:sz w:val="22"/>
+          <w:szCs w:val="22"/>
+        </w:rPr>
+        <w:t>Customized WordPress themes and plugins.</w:t>
+      </w:r>
+    </w:p>
+    <w:p>
+      <w:pPr>
+        <w:ind w:left="90" w:hanging="90"/>
+        <w:rPr>
+          <w:rFonts w:cstheme="minorHAnsi"/>
+        </w:rPr>
+      </w:pPr>
+      <w:r>
+        <w:rPr>
+          <w:rFonts w:cstheme="minorHAnsi"/>
+        </w:rPr>
+        <w:pict w14:anchorId="271D4C53">
+          <v:rect id="_x0000_i1035" style="width:0;height:1.5pt" o:hralign="center" o:hrstd="t" o:hr="t" fillcolor="#a0a0a0" stroked="f"/>
         </w:pict>
       </w:r>
     </w:p>
     <w:p>
       <w:pPr>
-        <w:spacing w:line="360" w:lineRule="auto"/>
         <w:ind w:left="90" w:hanging="90"/>
         <w:rPr>
           <w:rFonts w:cstheme="minorHAnsi"/>
@@ -653,15 +634,6 @@
           <w:szCs w:val="28"/>
         </w:rPr>
       </w:pPr>
-    </w:p>
-    <w:p>
-      <w:pPr>
-        <w:spacing w:line="360" w:lineRule="auto"/>
-        <w:ind w:left="90" w:hanging="90"/>
-        <w:rPr>
-          <w:rFonts w:cstheme="minorHAnsi"/>
-        </w:rPr>
-      </w:pPr>
       <w:r>
         <w:rPr>
           <w:rFonts w:cstheme="minorHAnsi"/>
@@ -670,109 +642,7 @@
           <w:sz w:val="28"/>
           <w:szCs w:val="28"/>
         </w:rPr>
-        <w:t>PROFESSIONAL SKILLS</w:t>
-      </w:r>
-    </w:p>
-    <w:p>
-      <w:pPr>
-        <w:numPr>
-          <w:ilvl w:val="0"/>
-          <w:numId w:val="2"/>
-        </w:numPr>
-        <w:ind w:left="90" w:hanging="90"/>
-        <w:rPr>
-          <w:rFonts w:cstheme="minorHAnsi"/>
-        </w:rPr>
-      </w:pPr>
-      <w:r>
-        <w:rPr>
-          <w:rFonts w:cstheme="minorHAnsi"/>
-        </w:rPr>
-        <w:t>Creative Problem-Solving</w:t>
-      </w:r>
-    </w:p>
-    <w:p>
-      <w:pPr>
-        <w:numPr>
-          <w:ilvl w:val="0"/>
-          <w:numId w:val="2"/>
-        </w:numPr>
-        <w:ind w:left="90" w:hanging="90"/>
-        <w:rPr>
-          <w:rFonts w:cstheme="minorHAnsi"/>
-        </w:rPr>
-      </w:pPr>
-      <w:r>
-        <w:rPr>
-          <w:rFonts w:cstheme="minorHAnsi"/>
-        </w:rPr>
-        <w:t>Team Collaboration &amp; Communication</w:t>
-      </w:r>
-    </w:p>
-    <w:p>
-      <w:pPr>
-        <w:numPr>
-          <w:ilvl w:val="0"/>
-          <w:numId w:val="2"/>
-        </w:numPr>
-        <w:ind w:left="90" w:hanging="90"/>
-        <w:rPr>
-          <w:rFonts w:cstheme="minorHAnsi"/>
-        </w:rPr>
-      </w:pPr>
-      <w:r>
-        <w:rPr>
-          <w:rFonts w:cstheme="minorHAnsi"/>
-        </w:rPr>
-        <w:t>Time &amp; Project Management</w:t>
-      </w:r>
-    </w:p>
-    <w:p>
-      <w:pPr>
-        <w:ind w:left="90" w:hanging="90"/>
-        <w:rPr>
-          <w:rFonts w:cstheme="minorHAnsi"/>
-        </w:rPr>
-      </w:pPr>
-      <w:r>
-        <w:rPr>
-          <w:rFonts w:cstheme="minorHAnsi"/>
-        </w:rPr>
-        <w:pict w14:anchorId="51D14EBD">
-          <v:rect id="_x0000_i1260" style="width:0;height:1.5pt" o:hralign="center" o:hrstd="t" o:hr="t" fillcolor="#a0a0a0" stroked="f"/>
-        </w:pict>
-      </w:r>
-    </w:p>
-    <w:p>
-      <w:pPr>
-        <w:ind w:left="90" w:hanging="90"/>
-        <w:rPr>
-          <w:rFonts w:cstheme="minorHAnsi"/>
-          <w:b/>
-          <w:bCs/>
-          <w:sz w:val="28"/>
-          <w:szCs w:val="28"/>
-        </w:rPr>
-      </w:pPr>
-      <w:r>
-        <w:rPr>
-          <w:rFonts w:cstheme="minorHAnsi"/>
-          <w:b/>
-          <w:bCs/>
-          <w:sz w:val="28"/>
-          <w:szCs w:val="28"/>
-        </w:rPr>
-        <w:t>PRO</w:t>
-      </w:r>
-      <w:r>
-        <w:rPr>
-          <w:rFonts w:cstheme="minorHAnsi"/>
-          <w:b/>
-          <w:bCs/>
-          <w:sz w:val="28"/>
-          <w:szCs w:val="28"/>
-        </w:rPr>
-        <w:t>JECTS</w:t>
+        <w:t>PROJECTS</w:t>
       </w:r>
     </w:p>
     <w:p>
@@ -790,7 +660,23 @@
           <w:i/>
           <w:iCs/>
         </w:rPr>
-        <w:t>Frontend Developer (Freelance) — 2022–Present</w:t>
+        <w:t xml:space="preserve">Frontend Developer (Freelance) — </w:t>
+      </w:r>
+      <w:r>
+        <w:rPr>
+          <w:rFonts w:cstheme="minorHAnsi"/>
+          <w:i/>
+          <w:iCs/>
+        </w:rPr>
+        <w:t>13/3/</w:t>
+      </w:r>
+      <w:r>
+        <w:rPr>
+          <w:rFonts w:cstheme="minorHAnsi"/>
+          <w:i/>
+          <w:iCs/>
+        </w:rPr>
+        <w:t>2022–Present</w:t>
       </w:r>
     </w:p>
     <w:p>
@@ -809,16 +695,10 @@
           <w:rStyle w:val="Strong"/>
           <w:rFonts w:cstheme="minorHAnsi"/>
         </w:rPr>
-        <w:t>Personal Portfolio Website</w:t>
-      </w:r>
-      <w:r>
-        <w:rPr>
-          <w:rStyle w:val="Strong"/>
-          <w:rFonts w:cstheme="minorHAnsi"/>
-        </w:rPr>
-        <w:t xml:space="preserve"> </w:t>
+        <w:t xml:space="preserve">Personal Portfolio Website </w:t>
       </w:r>
       <w:hyperlink r:id="rId11" w:history="1">
+        <w:proofErr w:type="spellStart"/>
         <w:r>
           <w:rPr>
             <w:rStyle w:val="Hyperlink"/>
@@ -828,6 +708,7 @@
           </w:rPr>
           <w:t>Github</w:t>
         </w:r>
+        <w:proofErr w:type="spellEnd"/>
       </w:hyperlink>
       <w:r>
         <w:rPr>
@@ -875,19 +756,7 @@
         <w:rPr>
           <w:rFonts w:cstheme="minorHAnsi"/>
         </w:rPr>
-        <w:t xml:space="preserve">A fully responsive portfolio highlighting </w:t>
-      </w:r>
-      <w:r>
-        <w:rPr>
-          <w:rFonts w:cstheme="minorHAnsi"/>
-        </w:rPr>
-        <w:t xml:space="preserve">my </w:t>
-      </w:r>
-      <w:r>
-        <w:rPr>
-          <w:rFonts w:cstheme="minorHAnsi"/>
-        </w:rPr>
-        <w:t>personal projects and SEO-friendly structure for improved visibility.</w:t>
+        <w:t>A fully responsive portfolio highlighting my personal projects and SEO-friendly structure for improved visibility.</w:t>
       </w:r>
     </w:p>
     <w:p>
@@ -904,8 +773,23 @@
         <w:rPr>
           <w:rFonts w:cstheme="minorHAnsi"/>
         </w:rPr>
+        <w:lastRenderedPageBreak/>
         <w:tab/>
-        <w:t>Tech stack: Html, Css, JavaScript.</w:t>
+        <w:t xml:space="preserve">Tech stack: Html, </w:t>
+      </w:r>
+      <w:proofErr w:type="spellStart"/>
+      <w:r>
+        <w:rPr>
+          <w:rFonts w:cstheme="minorHAnsi"/>
+        </w:rPr>
+        <w:t>Css</w:t>
+      </w:r>
+      <w:proofErr w:type="spellEnd"/>
+      <w:r>
+        <w:rPr>
+          <w:rFonts w:cstheme="minorHAnsi"/>
+        </w:rPr>
+        <w:t>, JavaScript.</w:t>
       </w:r>
     </w:p>
     <w:p>
@@ -943,6 +827,7 @@
         <w:tab/>
       </w:r>
       <w:hyperlink r:id="rId13" w:history="1">
+        <w:proofErr w:type="spellStart"/>
         <w:r>
           <w:rPr>
             <w:rStyle w:val="Hyperlink"/>
@@ -950,163 +835,9 @@
             <w:b/>
             <w:bCs/>
           </w:rPr>
-          <w:t>Github Link</w:t>
+          <w:t>Github</w:t>
         </w:r>
-      </w:hyperlink>
-      <w:r>
-        <w:rPr>
-          <w:rFonts w:cstheme="minorHAnsi"/>
-          <w:b/>
-          <w:bCs/>
-        </w:rPr>
-        <w:t xml:space="preserve"> | </w:t>
-      </w:r>
-      <w:r>
-        <w:rPr>
-          <w:rFonts w:cstheme="minorHAnsi"/>
-          <w:b/>
-          <w:bCs/>
-        </w:rPr>
-        <w:fldChar w:fldCharType="begin"/>
-      </w:r>
-      <w:r>
-        <w:rPr>
-          <w:rFonts w:cstheme="minorHAnsi"/>
-          <w:b/>
-          <w:bCs/>
-        </w:rPr>
-        <w:instrText>HYPERLINK "https://nexus-wine-theta.vercel.app/"</w:instrText>
-      </w:r>
-      <w:r>
-        <w:rPr>
-          <w:rFonts w:cstheme="minorHAnsi"/>
-        </w:rPr>
-      </w:r>
-      <w:r>
-        <w:rPr>
-          <w:rFonts w:cstheme="minorHAnsi"/>
-          <w:b/>
-          <w:bCs/>
-        </w:rPr>
-        <w:fldChar w:fldCharType="separate"/>
-      </w:r>
-      <w:r>
-        <w:rPr>
-          <w:rStyle w:val="Hyperlink"/>
-          <w:rFonts w:cstheme="minorHAnsi"/>
-          <w:b/>
-          <w:bCs/>
-        </w:rPr>
-        <w:t>Live L</w:t>
-      </w:r>
-      <w:r>
-        <w:rPr>
-          <w:rStyle w:val="Hyperlink"/>
-          <w:rFonts w:cstheme="minorHAnsi"/>
-          <w:b/>
-          <w:bCs/>
-        </w:rPr>
-        <w:t>i</w:t>
-      </w:r>
-      <w:r>
-        <w:rPr>
-          <w:rStyle w:val="Hyperlink"/>
-          <w:rFonts w:cstheme="minorHAnsi"/>
-          <w:b/>
-          <w:bCs/>
-        </w:rPr>
-        <w:t>nk</w:t>
-      </w:r>
-    </w:p>
-    <w:p>
-      <w:pPr>
-        <w:ind w:left="90"/>
-        <w:rPr>
-          <w:rFonts w:cstheme="minorHAnsi"/>
-        </w:rPr>
-      </w:pPr>
-      <w:r>
-        <w:rPr>
-          <w:rFonts w:cstheme="minorHAnsi"/>
-          <w:b/>
-          <w:bCs/>
-        </w:rPr>
-        <w:fldChar w:fldCharType="end"/>
-      </w:r>
-      <w:r>
-        <w:rPr>
-          <w:rFonts w:cstheme="minorHAnsi"/>
-        </w:rPr>
-        <w:t xml:space="preserve">A modern, powerful business intelligence dashboard built with React, Tailwind CSS, and </w:t>
-      </w:r>
-      <w:r>
-        <w:rPr>
-          <w:rFonts w:cstheme="minorHAnsi"/>
-        </w:rPr>
-        <w:t xml:space="preserve">             </w:t>
-      </w:r>
-      <w:r>
-        <w:rPr>
-          <w:rFonts w:cstheme="minorHAnsi"/>
-        </w:rPr>
-        <w:t xml:space="preserve">       </w:t>
-      </w:r>
-      <w:r>
-        <w:rPr>
-          <w:rFonts w:cstheme="minorHAnsi"/>
-        </w:rPr>
-        <w:t>Recharts. Nexus provides comprehensive business analytics, customer management, inventory tracking, and reporting tools in a beautiful, responsive interface.</w:t>
-      </w:r>
-    </w:p>
-    <w:p>
-      <w:pPr>
-        <w:ind w:left="90"/>
-        <w:rPr>
-          <w:rFonts w:cstheme="minorHAnsi"/>
-        </w:rPr>
-      </w:pPr>
-      <w:r>
-        <w:rPr>
-          <w:rFonts w:cstheme="minorHAnsi"/>
-        </w:rPr>
-        <w:t>Tech stack: React, Tailwind Css</w:t>
-      </w:r>
-      <w:r>
-        <w:rPr>
-          <w:rFonts w:cstheme="minorHAnsi"/>
-        </w:rPr>
-        <w:t>.</w:t>
-      </w:r>
-    </w:p>
-    <w:p>
-      <w:pPr>
-        <w:pStyle w:val="ListParagraph"/>
-        <w:numPr>
-          <w:ilvl w:val="0"/>
-          <w:numId w:val="10"/>
-        </w:numPr>
-        <w:ind w:left="90" w:hanging="90"/>
-        <w:rPr>
-          <w:rFonts w:cstheme="minorHAnsi"/>
-        </w:rPr>
-      </w:pPr>
-      <w:r>
-        <w:rPr>
-          <w:rFonts w:cstheme="minorHAnsi"/>
-          <w:b/>
-          <w:bCs/>
-        </w:rPr>
-        <w:t>ZORIEJẸUN</w:t>
-      </w:r>
-      <w:r>
-        <w:rPr>
-          <w:rFonts w:cstheme="minorHAnsi"/>
-          <w:b/>
-          <w:bCs/>
-        </w:rPr>
-        <w:tab/>
-      </w:r>
-      <w:hyperlink r:id="rId14" w:history="1">
+        <w:proofErr w:type="spellEnd"/>
         <w:r>
           <w:rPr>
             <w:rStyle w:val="Hyperlink"/>
@@ -1114,7 +845,156 @@
             <w:b/>
             <w:bCs/>
           </w:rPr>
-          <w:t>Github Link</w:t>
+          <w:t xml:space="preserve"> Link</w:t>
+        </w:r>
+      </w:hyperlink>
+      <w:r>
+        <w:rPr>
+          <w:rFonts w:cstheme="minorHAnsi"/>
+          <w:b/>
+          <w:bCs/>
+        </w:rPr>
+        <w:t xml:space="preserve"> | </w:t>
+      </w:r>
+      <w:r>
+        <w:rPr>
+          <w:rFonts w:cstheme="minorHAnsi"/>
+          <w:b/>
+          <w:bCs/>
+        </w:rPr>
+        <w:fldChar w:fldCharType="begin"/>
+      </w:r>
+      <w:r>
+        <w:rPr>
+          <w:rFonts w:cstheme="minorHAnsi"/>
+          <w:b/>
+          <w:bCs/>
+        </w:rPr>
+        <w:instrText>HYPERLINK "https://nexus-wine-theta.vercel.app/"</w:instrText>
+      </w:r>
+      <w:r>
+        <w:rPr>
+          <w:rFonts w:cstheme="minorHAnsi"/>
+          <w:b/>
+          <w:bCs/>
+        </w:rPr>
+      </w:r>
+      <w:r>
+        <w:rPr>
+          <w:rFonts w:cstheme="minorHAnsi"/>
+          <w:b/>
+          <w:bCs/>
+        </w:rPr>
+        <w:fldChar w:fldCharType="separate"/>
+      </w:r>
+      <w:r>
+        <w:rPr>
+          <w:rStyle w:val="Hyperlink"/>
+          <w:rFonts w:cstheme="minorHAnsi"/>
+          <w:b/>
+          <w:bCs/>
+        </w:rPr>
+        <w:t>Live Link</w:t>
+      </w:r>
+    </w:p>
+    <w:p>
+      <w:pPr>
+        <w:ind w:left="90"/>
+        <w:rPr>
+          <w:rFonts w:cstheme="minorHAnsi"/>
+        </w:rPr>
+      </w:pPr>
+      <w:r>
+        <w:rPr>
+          <w:rFonts w:cstheme="minorHAnsi"/>
+          <w:b/>
+          <w:bCs/>
+        </w:rPr>
+        <w:fldChar w:fldCharType="end"/>
+      </w:r>
+      <w:r>
+        <w:rPr>
+          <w:rFonts w:cstheme="minorHAnsi"/>
+        </w:rPr>
+        <w:t>A modern, powerful business intelligence dashboard built with React, Tailwind CSS, and                     Recharts. Nexus provides comprehensive business analytics, customer management, inventory tracking, and reporting tools in a beautiful, responsive interface.</w:t>
+      </w:r>
+    </w:p>
+    <w:p>
+      <w:pPr>
+        <w:ind w:left="90"/>
+        <w:rPr>
+          <w:rFonts w:cstheme="minorHAnsi"/>
+        </w:rPr>
+      </w:pPr>
+      <w:r>
+        <w:rPr>
+          <w:rFonts w:cstheme="minorHAnsi"/>
+        </w:rPr>
+        <w:t xml:space="preserve">Tech stack: React, Tailwind </w:t>
+      </w:r>
+      <w:proofErr w:type="spellStart"/>
+      <w:r>
+        <w:rPr>
+          <w:rFonts w:cstheme="minorHAnsi"/>
+        </w:rPr>
+        <w:t>Css</w:t>
+      </w:r>
+      <w:proofErr w:type="spellEnd"/>
+      <w:r>
+        <w:rPr>
+          <w:rFonts w:cstheme="minorHAnsi"/>
+        </w:rPr>
+        <w:t>.</w:t>
+      </w:r>
+    </w:p>
+    <w:p>
+      <w:pPr>
+        <w:pStyle w:val="ListParagraph"/>
+        <w:numPr>
+          <w:ilvl w:val="0"/>
+          <w:numId w:val="10"/>
+        </w:numPr>
+        <w:ind w:left="90" w:hanging="90"/>
+        <w:rPr>
+          <w:rFonts w:cstheme="minorHAnsi"/>
+        </w:rPr>
+      </w:pPr>
+      <w:r>
+        <w:rPr>
+          <w:rFonts w:cstheme="minorHAnsi"/>
+          <w:b/>
+          <w:bCs/>
+        </w:rPr>
+        <w:t>ZORIEJẸUN</w:t>
+      </w:r>
+      <w:r>
+        <w:rPr>
+          <w:rFonts w:cstheme="minorHAnsi"/>
+          <w:b/>
+          <w:bCs/>
+        </w:rPr>
+        <w:tab/>
+      </w:r>
+      <w:hyperlink r:id="rId14" w:history="1">
+        <w:proofErr w:type="spellStart"/>
+        <w:r>
+          <w:rPr>
+            <w:rStyle w:val="Hyperlink"/>
+            <w:rFonts w:cstheme="minorHAnsi"/>
+            <w:b/>
+            <w:bCs/>
+          </w:rPr>
+          <w:t>Github</w:t>
+        </w:r>
+        <w:proofErr w:type="spellEnd"/>
+        <w:r>
+          <w:rPr>
+            <w:rStyle w:val="Hyperlink"/>
+            <w:rFonts w:cstheme="minorHAnsi"/>
+            <w:b/>
+            <w:bCs/>
+          </w:rPr>
+          <w:t xml:space="preserve"> Link</w:t>
         </w:r>
       </w:hyperlink>
       <w:r>
@@ -1181,7 +1061,19 @@
           <w:rFonts w:cstheme="minorHAnsi"/>
         </w:rPr>
         <w:noBreakHyphen/>
-        <w:t>side validation—demonstrating form handling and user input validation. Designed with a mobile</w:t>
+        <w:t>side validation</w:t>
+      </w:r>
+      <w:r>
+        <w:rPr>
+          <w:rFonts w:cstheme="minorHAnsi"/>
+        </w:rPr>
+        <w:t xml:space="preserve">, </w:t>
+      </w:r>
+      <w:r>
+        <w:rPr>
+          <w:rFonts w:cstheme="minorHAnsi"/>
+        </w:rPr>
+        <w:t>demonstrating form handling and user input validation. Designed with a mobile</w:t>
       </w:r>
       <w:r>
         <w:rPr>
@@ -1202,20 +1094,16 @@
         <w:rPr>
           <w:rFonts w:cstheme="minorHAnsi"/>
         </w:rPr>
-        <w:t xml:space="preserve">Tech stack: </w:t>
-      </w:r>
-      <w:r>
-        <w:rPr>
-          <w:rFonts w:cstheme="minorHAnsi"/>
-        </w:rPr>
-        <w:t>Html</w:t>
-      </w:r>
-      <w:r>
-        <w:rPr>
-          <w:rFonts w:cstheme="minorHAnsi"/>
-        </w:rPr>
-        <w:t>, Css</w:t>
-      </w:r>
+        <w:t xml:space="preserve">Tech stack: Html, </w:t>
+      </w:r>
+      <w:proofErr w:type="spellStart"/>
+      <w:r>
+        <w:rPr>
+          <w:rFonts w:cstheme="minorHAnsi"/>
+        </w:rPr>
+        <w:t>Css</w:t>
+      </w:r>
+      <w:proofErr w:type="spellEnd"/>
       <w:r>
         <w:rPr>
           <w:rFonts w:cstheme="minorHAnsi"/>
@@ -1237,13 +1125,23 @@
           <w:bCs/>
         </w:rPr>
       </w:pPr>
+      <w:proofErr w:type="spellStart"/>
       <w:r>
         <w:rPr>
           <w:rFonts w:cstheme="minorHAnsi"/>
           <w:b/>
           <w:bCs/>
         </w:rPr>
-        <w:t xml:space="preserve">SmartLiving </w:t>
+        <w:t>SmartLiving</w:t>
+      </w:r>
+      <w:proofErr w:type="spellEnd"/>
+      <w:r>
+        <w:rPr>
+          <w:rFonts w:cstheme="minorHAnsi"/>
+          <w:b/>
+          <w:bCs/>
+        </w:rPr>
+        <w:t xml:space="preserve"> </w:t>
       </w:r>
       <w:r>
         <w:rPr>
@@ -1291,12 +1189,19 @@
           <w:rFonts w:cstheme="minorHAnsi"/>
         </w:rPr>
       </w:pPr>
-      <w:r>
-        <w:rPr>
-          <w:rFonts w:cstheme="minorHAnsi"/>
-        </w:rPr>
-        <w:lastRenderedPageBreak/>
-        <w:t>SmartLiving is a premium, high-tech platform designed to bridge the gap between real estate and the Internet of Things (IoT). It's built with a sleek, futuristic interface and it provides users with a central ecosystem to discover, manage, and automate smart properties.</w:t>
+      <w:proofErr w:type="spellStart"/>
+      <w:r>
+        <w:rPr>
+          <w:rFonts w:cstheme="minorHAnsi"/>
+        </w:rPr>
+        <w:t>SmartLiving</w:t>
+      </w:r>
+      <w:proofErr w:type="spellEnd"/>
+      <w:r>
+        <w:rPr>
+          <w:rFonts w:cstheme="minorHAnsi"/>
+        </w:rPr>
+        <w:t xml:space="preserve"> is a premium, high-tech platform designed to bridge the gap between real estate and the Internet of Things (IoT). It's built with a sleek, futuristic interface and it provides users with a central ecosystem to discover, manage, and automate smart properties.</w:t>
       </w:r>
     </w:p>
     <w:p>
@@ -1310,7 +1215,13 @@
         <w:rPr>
           <w:rFonts w:cstheme="minorHAnsi"/>
         </w:rPr>
-        <w:t>Tech stack: React, Tailwind Css</w:t>
+        <w:t>Tech stack: React, Tailwind C</w:t>
+      </w:r>
+      <w:r>
+        <w:rPr>
+          <w:rFonts w:cstheme="minorHAnsi"/>
+        </w:rPr>
+        <w:t>SS.</w:t>
       </w:r>
     </w:p>
     <w:p>
@@ -1324,20 +1235,18 @@
         <w:rPr>
           <w:rFonts w:cstheme="minorHAnsi"/>
         </w:rPr>
-        <w:pict w14:anchorId="47F66B0A">
-          <v:rect id="_x0000_i1265" style="width:0;height:1.5pt" o:hralign="center" o:hrstd="t" o:hr="t" fillcolor="#a0a0a0" stroked="f"/>
+        <w:pict w14:anchorId="507098ED">
+          <v:rect id="_x0000_i1027" style="width:0;height:1.5pt" o:hralign="center" o:hrstd="t" o:hr="t" fillcolor="#a0a0a0" stroked="f"/>
         </w:pict>
       </w:r>
     </w:p>
     <w:p>
       <w:pPr>
-        <w:ind w:left="90" w:hanging="90"/>
+        <w:ind w:left="90"/>
         <w:rPr>
           <w:rFonts w:cstheme="minorHAnsi"/>
           <w:b/>
           <w:bCs/>
-          <w:i/>
-          <w:iCs/>
           <w:sz w:val="28"/>
           <w:szCs w:val="28"/>
         </w:rPr>
@@ -1347,8 +1256,601 @@
           <w:rFonts w:cstheme="minorHAnsi"/>
           <w:b/>
           <w:bCs/>
-          <w:i/>
-          <w:iCs/>
+          <w:sz w:val="28"/>
+          <w:szCs w:val="28"/>
+        </w:rPr>
+        <w:t xml:space="preserve">EDUCATION   </w:t>
+      </w:r>
+      <w:r>
+        <w:rPr>
+          <w:rFonts w:cstheme="minorHAnsi"/>
+          <w:b/>
+          <w:bCs/>
+          <w:sz w:val="28"/>
+          <w:szCs w:val="28"/>
+        </w:rPr>
+        <w:tab/>
+      </w:r>
+    </w:p>
+    <w:p>
+      <w:pPr>
+        <w:ind w:left="90"/>
+        <w:rPr>
+          <w:rFonts w:cstheme="minorHAnsi"/>
+        </w:rPr>
+      </w:pPr>
+      <w:r>
+        <w:rPr>
+          <w:rFonts w:cstheme="minorHAnsi"/>
+          <w:b/>
+          <w:bCs/>
+        </w:rPr>
+        <w:t>BACHELOR OF SCIENCE</w:t>
+      </w:r>
+      <w:r>
+        <w:rPr>
+          <w:rFonts w:cstheme="minorHAnsi"/>
+        </w:rPr>
+        <w:t>: Computer Science, 2025</w:t>
+      </w:r>
+    </w:p>
+    <w:p>
+      <w:pPr>
+        <w:ind w:left="90"/>
+        <w:rPr>
+          <w:rFonts w:cstheme="minorHAnsi"/>
+        </w:rPr>
+      </w:pPr>
+      <w:r>
+        <w:rPr>
+          <w:rFonts w:cstheme="minorHAnsi"/>
+          <w:b/>
+          <w:bCs/>
+        </w:rPr>
+        <w:t>BINGHAM UNIVERSITY</w:t>
+      </w:r>
+      <w:r>
+        <w:rPr>
+          <w:rFonts w:cstheme="minorHAnsi"/>
+        </w:rPr>
+        <w:t>:</w:t>
+      </w:r>
+      <w:r>
+        <w:rPr>
+          <w:rFonts w:cstheme="minorHAnsi"/>
+        </w:rPr>
+        <w:t xml:space="preserve"> Nasarawa State. </w:t>
+      </w:r>
+    </w:p>
+    <w:p>
+      <w:pPr>
+        <w:ind w:left="90" w:hanging="90"/>
+        <w:rPr>
+          <w:rFonts w:cstheme="minorHAnsi"/>
+        </w:rPr>
+      </w:pPr>
+      <w:r>
+        <w:rPr>
+          <w:rFonts w:cstheme="minorHAnsi"/>
+        </w:rPr>
+        <w:pict w14:anchorId="43AD5CB0">
+          <v:rect id="_x0000_i1028" style="width:0;height:1.5pt" o:hralign="center" o:hrstd="t" o:hr="t" fillcolor="#a0a0a0" stroked="f"/>
+        </w:pict>
+      </w:r>
+    </w:p>
+    <w:p>
+      <w:pPr>
+        <w:ind w:left="90" w:hanging="90"/>
+        <w:rPr>
+          <w:rFonts w:cstheme="minorHAnsi"/>
+          <w:b/>
+          <w:bCs/>
+          <w:sz w:val="28"/>
+          <w:szCs w:val="28"/>
+        </w:rPr>
+      </w:pPr>
+      <w:r>
+        <w:rPr>
+          <w:rFonts w:cstheme="minorHAnsi"/>
+          <w:b/>
+          <w:bCs/>
+          <w:sz w:val="28"/>
+          <w:szCs w:val="28"/>
+        </w:rPr>
+        <w:t>SOFT SKILLS</w:t>
+      </w:r>
+    </w:p>
+    <w:p>
+      <w:pPr>
+        <w:pStyle w:val="ListParagraph"/>
+        <w:numPr>
+          <w:ilvl w:val="0"/>
+          <w:numId w:val="13"/>
+        </w:numPr>
+        <w:rPr>
+          <w:rFonts w:cstheme="minorHAnsi"/>
+        </w:rPr>
+      </w:pPr>
+      <w:r>
+        <w:rPr>
+          <w:rFonts w:cstheme="minorHAnsi"/>
+        </w:rPr>
+        <w:t xml:space="preserve">Attention to </w:t>
+      </w:r>
+      <w:r>
+        <w:rPr>
+          <w:rFonts w:cstheme="minorHAnsi"/>
+        </w:rPr>
+        <w:t>Detail</w:t>
+      </w:r>
+    </w:p>
+    <w:p>
+      <w:pPr>
+        <w:pStyle w:val="ListParagraph"/>
+        <w:numPr>
+          <w:ilvl w:val="0"/>
+          <w:numId w:val="13"/>
+        </w:numPr>
+        <w:rPr>
+          <w:rFonts w:cstheme="minorHAnsi"/>
+        </w:rPr>
+      </w:pPr>
+      <w:r>
+        <w:rPr>
+          <w:rFonts w:cstheme="minorHAnsi"/>
+        </w:rPr>
+        <w:t>Multitasking</w:t>
+      </w:r>
+    </w:p>
+    <w:p>
+      <w:pPr>
+        <w:pStyle w:val="ListParagraph"/>
+        <w:numPr>
+          <w:ilvl w:val="0"/>
+          <w:numId w:val="13"/>
+        </w:numPr>
+        <w:rPr>
+          <w:rFonts w:cstheme="minorHAnsi"/>
+        </w:rPr>
+      </w:pPr>
+      <w:r>
+        <w:rPr>
+          <w:rFonts w:cstheme="minorHAnsi"/>
+        </w:rPr>
+        <w:t>Highly Organized</w:t>
+      </w:r>
+    </w:p>
+    <w:p>
+      <w:pPr>
+        <w:pStyle w:val="ListParagraph"/>
+        <w:numPr>
+          <w:ilvl w:val="0"/>
+          <w:numId w:val="13"/>
+        </w:numPr>
+        <w:rPr>
+          <w:rFonts w:cstheme="minorHAnsi"/>
+        </w:rPr>
+      </w:pPr>
+      <w:r>
+        <w:rPr>
+          <w:rFonts w:cstheme="minorHAnsi"/>
+        </w:rPr>
+        <w:t>Team Collaboration</w:t>
+      </w:r>
+    </w:p>
+    <w:p>
+      <w:pPr>
+        <w:pStyle w:val="ListParagraph"/>
+        <w:numPr>
+          <w:ilvl w:val="0"/>
+          <w:numId w:val="13"/>
+        </w:numPr>
+        <w:rPr>
+          <w:rFonts w:cstheme="minorHAnsi"/>
+        </w:rPr>
+      </w:pPr>
+      <w:r>
+        <w:rPr>
+          <w:rFonts w:cstheme="minorHAnsi"/>
+        </w:rPr>
+        <w:t>Fast Learner</w:t>
+      </w:r>
+    </w:p>
+    <w:p>
+      <w:pPr>
+        <w:pStyle w:val="ListParagraph"/>
+        <w:numPr>
+          <w:ilvl w:val="0"/>
+          <w:numId w:val="13"/>
+        </w:numPr>
+        <w:rPr>
+          <w:rFonts w:cstheme="minorHAnsi"/>
+        </w:rPr>
+      </w:pPr>
+      <w:r>
+        <w:rPr>
+          <w:rFonts w:cstheme="minorHAnsi"/>
+        </w:rPr>
+        <w:lastRenderedPageBreak/>
+        <w:t>Time Management</w:t>
+      </w:r>
+    </w:p>
+    <w:p>
+      <w:pPr>
+        <w:pStyle w:val="ListParagraph"/>
+        <w:numPr>
+          <w:ilvl w:val="0"/>
+          <w:numId w:val="13"/>
+        </w:numPr>
+        <w:rPr>
+          <w:rFonts w:cstheme="minorHAnsi"/>
+        </w:rPr>
+      </w:pPr>
+      <w:r>
+        <w:rPr>
+          <w:rFonts w:cstheme="minorHAnsi"/>
+        </w:rPr>
+        <w:t>Fast-paced worker</w:t>
+      </w:r>
+    </w:p>
+    <w:p>
+      <w:pPr>
+        <w:pStyle w:val="ListParagraph"/>
+        <w:numPr>
+          <w:ilvl w:val="0"/>
+          <w:numId w:val="13"/>
+        </w:numPr>
+        <w:rPr>
+          <w:rFonts w:cstheme="minorHAnsi"/>
+        </w:rPr>
+      </w:pPr>
+      <w:r>
+        <w:rPr>
+          <w:rFonts w:cstheme="minorHAnsi"/>
+        </w:rPr>
+        <w:t>Good Communication Skills</w:t>
+      </w:r>
+    </w:p>
+    <w:p>
+      <w:pPr>
+        <w:ind w:left="90" w:hanging="90"/>
+        <w:rPr>
+          <w:rFonts w:cstheme="minorHAnsi"/>
+        </w:rPr>
+      </w:pPr>
+      <w:r>
+        <w:rPr>
+          <w:rFonts w:cstheme="minorHAnsi"/>
+        </w:rPr>
+        <w:pict w14:anchorId="07E1956C">
+          <v:rect id="_x0000_i1029" style="width:0;height:1.5pt" o:hralign="center" o:hrstd="t" o:hr="t" fillcolor="#a0a0a0" stroked="f"/>
+        </w:pict>
+      </w:r>
+    </w:p>
+    <w:p>
+      <w:pPr>
+        <w:ind w:left="90" w:hanging="90"/>
+        <w:rPr>
+          <w:rFonts w:cstheme="minorHAnsi"/>
+          <w:b/>
+          <w:bCs/>
+          <w:sz w:val="28"/>
+          <w:szCs w:val="28"/>
+        </w:rPr>
+      </w:pPr>
+    </w:p>
+    <w:p>
+      <w:pPr>
+        <w:ind w:left="90" w:hanging="90"/>
+        <w:rPr>
+          <w:rFonts w:cstheme="minorHAnsi"/>
+        </w:rPr>
+      </w:pPr>
+      <w:r>
+        <w:rPr>
+          <w:rFonts w:cstheme="minorHAnsi"/>
+          <w:b/>
+          <w:bCs/>
+          <w:sz w:val="28"/>
+          <w:szCs w:val="28"/>
+        </w:rPr>
+        <w:t>CORE COMPETENCIES</w:t>
+      </w:r>
+      <w:r>
+        <w:rPr>
+          <w:rFonts w:cstheme="minorHAnsi"/>
+        </w:rPr>
+        <w:t xml:space="preserve"> </w:t>
+      </w:r>
+    </w:p>
+    <w:p>
+      <w:pPr>
+        <w:ind w:left="90"/>
+        <w:rPr>
+          <w:rFonts w:cstheme="minorHAnsi"/>
+        </w:rPr>
+      </w:pPr>
+      <w:r>
+        <w:rPr>
+          <w:rFonts w:cstheme="minorHAnsi"/>
+        </w:rPr>
+        <w:t>Full Stack Development</w:t>
+      </w:r>
+      <w:r>
+        <w:rPr>
+          <w:rFonts w:cstheme="minorHAnsi"/>
+        </w:rPr>
+        <w:t xml:space="preserve"> </w:t>
+      </w:r>
+      <w:r>
+        <w:rPr>
+          <w:rFonts w:cstheme="minorHAnsi"/>
+        </w:rPr>
+        <w:t>|</w:t>
+      </w:r>
+      <w:r>
+        <w:rPr>
+          <w:rFonts w:cstheme="minorHAnsi"/>
+        </w:rPr>
+        <w:t xml:space="preserve"> Agile Methodology |</w:t>
+      </w:r>
+      <w:r>
+        <w:rPr>
+          <w:rFonts w:cstheme="minorHAnsi"/>
+        </w:rPr>
+        <w:t xml:space="preserve"> </w:t>
+      </w:r>
+      <w:r>
+        <w:rPr>
+          <w:rFonts w:cstheme="minorHAnsi"/>
+        </w:rPr>
+        <w:t>Responsive Web Design | SEO Optimization | Cross-browser Compatibility | Performance</w:t>
+      </w:r>
+      <w:r>
+        <w:rPr>
+          <w:rFonts w:cstheme="minorHAnsi"/>
+        </w:rPr>
+        <w:t xml:space="preserve"> </w:t>
+      </w:r>
+      <w:r>
+        <w:rPr>
+          <w:rFonts w:cstheme="minorHAnsi"/>
+        </w:rPr>
+        <w:t>Tuning</w:t>
+      </w:r>
+    </w:p>
+    <w:p>
+      <w:pPr>
+        <w:ind w:left="90"/>
+        <w:rPr>
+          <w:rFonts w:cstheme="minorHAnsi"/>
+        </w:rPr>
+      </w:pPr>
+      <w:r>
+        <w:rPr>
+          <w:rFonts w:cstheme="minorHAnsi"/>
+        </w:rPr>
+        <w:pict w14:anchorId="6A5D23B9">
+          <v:rect id="_x0000_i1031" style="width:0;height:1.5pt" o:hralign="center" o:hrstd="t" o:hr="t" fillcolor="#a0a0a0" stroked="f"/>
+        </w:pict>
+      </w:r>
+    </w:p>
+    <w:p>
+      <w:pPr>
+        <w:ind w:left="90" w:hanging="90"/>
+        <w:rPr>
+          <w:rFonts w:cstheme="minorHAnsi"/>
+          <w:b/>
+          <w:bCs/>
+          <w:sz w:val="28"/>
+          <w:szCs w:val="28"/>
+        </w:rPr>
+      </w:pPr>
+      <w:r>
+        <w:rPr>
+          <w:rFonts w:cstheme="minorHAnsi"/>
+          <w:b/>
+          <w:bCs/>
+          <w:sz w:val="28"/>
+          <w:szCs w:val="28"/>
+        </w:rPr>
+        <w:t>TECHNICAL SKILLS</w:t>
+      </w:r>
+    </w:p>
+    <w:p>
+      <w:pPr>
+        <w:pStyle w:val="ListParagraph"/>
+        <w:numPr>
+          <w:ilvl w:val="0"/>
+          <w:numId w:val="12"/>
+        </w:numPr>
+        <w:rPr>
+          <w:rFonts w:cstheme="minorHAnsi"/>
+        </w:rPr>
+      </w:pPr>
+      <w:r>
+        <w:rPr>
+          <w:rFonts w:cstheme="minorHAnsi"/>
+        </w:rPr>
+        <w:t>Scripting Languages: HTML, CSS</w:t>
+      </w:r>
+    </w:p>
+    <w:p>
+      <w:pPr>
+        <w:pStyle w:val="ListParagraph"/>
+        <w:numPr>
+          <w:ilvl w:val="0"/>
+          <w:numId w:val="12"/>
+        </w:numPr>
+        <w:rPr>
+          <w:rFonts w:cstheme="minorHAnsi"/>
+        </w:rPr>
+      </w:pPr>
+      <w:r>
+        <w:rPr>
+          <w:rFonts w:cstheme="minorHAnsi"/>
+        </w:rPr>
+        <w:t xml:space="preserve">Programming Languages: </w:t>
+      </w:r>
+      <w:proofErr w:type="spellStart"/>
+      <w:r>
+        <w:rPr>
+          <w:rFonts w:cstheme="minorHAnsi"/>
+        </w:rPr>
+        <w:t>Javascript</w:t>
+      </w:r>
+      <w:proofErr w:type="spellEnd"/>
+    </w:p>
+    <w:p>
+      <w:pPr>
+        <w:pStyle w:val="ListParagraph"/>
+        <w:numPr>
+          <w:ilvl w:val="0"/>
+          <w:numId w:val="12"/>
+        </w:numPr>
+        <w:rPr>
+          <w:rFonts w:cstheme="minorHAnsi"/>
+        </w:rPr>
+      </w:pPr>
+      <w:r>
+        <w:rPr>
+          <w:rFonts w:cstheme="minorHAnsi"/>
+        </w:rPr>
+        <w:t>Web Development Frameworks: React.js, Node.js</w:t>
+      </w:r>
+    </w:p>
+    <w:p>
+      <w:pPr>
+        <w:pStyle w:val="ListParagraph"/>
+        <w:numPr>
+          <w:ilvl w:val="0"/>
+          <w:numId w:val="12"/>
+        </w:numPr>
+        <w:rPr>
+          <w:rFonts w:cstheme="minorHAnsi"/>
+        </w:rPr>
+      </w:pPr>
+      <w:r>
+        <w:rPr>
+          <w:rFonts w:cstheme="minorHAnsi"/>
+        </w:rPr>
+        <w:t xml:space="preserve">Developer Tools: </w:t>
+      </w:r>
+      <w:proofErr w:type="spellStart"/>
+      <w:r>
+        <w:rPr>
+          <w:rFonts w:cstheme="minorHAnsi"/>
+        </w:rPr>
+        <w:t>Github</w:t>
+      </w:r>
+      <w:proofErr w:type="spellEnd"/>
+      <w:r>
+        <w:rPr>
+          <w:rFonts w:cstheme="minorHAnsi"/>
+        </w:rPr>
+        <w:t>, VS Code, Postman</w:t>
+      </w:r>
+    </w:p>
+    <w:p>
+      <w:pPr>
+        <w:pStyle w:val="ListParagraph"/>
+        <w:numPr>
+          <w:ilvl w:val="0"/>
+          <w:numId w:val="12"/>
+        </w:numPr>
+        <w:rPr>
+          <w:rFonts w:cstheme="minorHAnsi"/>
+        </w:rPr>
+      </w:pPr>
+      <w:r>
+        <w:rPr>
+          <w:rFonts w:cstheme="minorHAnsi"/>
+        </w:rPr>
+        <w:t>Design and UI Tools: Figma, Tailwind CSS</w:t>
+      </w:r>
+      <w:r>
+        <w:rPr>
+          <w:rFonts w:cstheme="minorHAnsi"/>
+        </w:rPr>
+        <w:t>, Illustrator</w:t>
+      </w:r>
+    </w:p>
+    <w:p>
+      <w:pPr>
+        <w:pStyle w:val="ListParagraph"/>
+        <w:numPr>
+          <w:ilvl w:val="0"/>
+          <w:numId w:val="12"/>
+        </w:numPr>
+        <w:rPr>
+          <w:rFonts w:cstheme="minorHAnsi"/>
+        </w:rPr>
+      </w:pPr>
+      <w:r>
+        <w:rPr>
+          <w:rFonts w:cstheme="minorHAnsi"/>
+        </w:rPr>
+        <w:t>Backend: MySQL, Git Version Control</w:t>
+      </w:r>
+    </w:p>
+    <w:p>
+      <w:pPr>
+        <w:pStyle w:val="ListParagraph"/>
+        <w:numPr>
+          <w:ilvl w:val="0"/>
+          <w:numId w:val="12"/>
+        </w:numPr>
+        <w:rPr>
+          <w:rFonts w:cstheme="minorHAnsi"/>
+        </w:rPr>
+      </w:pPr>
+      <w:r>
+        <w:rPr>
+          <w:rFonts w:cstheme="minorHAnsi"/>
+        </w:rPr>
+        <w:t xml:space="preserve">ORM and Database: </w:t>
+      </w:r>
+      <w:proofErr w:type="spellStart"/>
+      <w:r>
+        <w:rPr>
+          <w:rFonts w:cstheme="minorHAnsi"/>
+        </w:rPr>
+        <w:t>MongoDb</w:t>
+      </w:r>
+      <w:proofErr w:type="spellEnd"/>
+    </w:p>
+    <w:p>
+      <w:pPr>
+        <w:ind w:left="90" w:hanging="90"/>
+        <w:rPr>
+          <w:rFonts w:cstheme="minorHAnsi"/>
+        </w:rPr>
+      </w:pPr>
+      <w:r>
+        <w:rPr>
+          <w:rFonts w:cstheme="minorHAnsi"/>
+        </w:rPr>
+        <w:pict w14:anchorId="47F66B0A">
+          <v:rect id="_x0000_i1032" style="width:0;height:1.5pt" o:hralign="center" o:hrstd="t" o:hr="t" fillcolor="#a0a0a0" stroked="f"/>
+        </w:pict>
+      </w:r>
+    </w:p>
+    <w:p>
+      <w:pPr>
+        <w:ind w:left="90" w:hanging="90"/>
+        <w:rPr>
+          <w:rFonts w:cstheme="minorHAnsi"/>
+          <w:b/>
+          <w:bCs/>
+          <w:sz w:val="28"/>
+          <w:szCs w:val="28"/>
+        </w:rPr>
+      </w:pPr>
+      <w:r>
+        <w:rPr>
+          <w:rFonts w:cstheme="minorHAnsi"/>
+          <w:b/>
+          <w:bCs/>
           <w:sz w:val="28"/>
           <w:szCs w:val="28"/>
         </w:rPr>
@@ -1372,37 +1874,25 @@
         <w:rPr>
           <w:rFonts w:cstheme="minorHAnsi"/>
         </w:rPr>
-        <w:t xml:space="preserve">Collaborated with designers to translate </w:t>
-      </w:r>
-      <w:r>
-        <w:rPr>
-          <w:rFonts w:cstheme="minorHAnsi"/>
-        </w:rPr>
-        <w:t>4+</w:t>
-      </w:r>
-      <w:r>
-        <w:rPr>
-          <w:rFonts w:cstheme="minorHAnsi"/>
-        </w:rPr>
-        <w:t xml:space="preserve"> Figma mockups into pixel-perfect web layouts, achieving </w:t>
-      </w:r>
-      <w:r>
-        <w:rPr>
-          <w:rFonts w:cstheme="minorHAnsi"/>
-        </w:rPr>
-        <w:t>100</w:t>
-      </w:r>
-      <w:r>
-        <w:rPr>
-          <w:rFonts w:cstheme="minorHAnsi"/>
-        </w:rPr>
-        <w:t>% design accuracy</w:t>
-      </w:r>
-      <w:r>
-        <w:rPr>
-          <w:rFonts w:cstheme="minorHAnsi"/>
-        </w:rPr>
-        <w:t>.</w:t>
+        <w:t>Collaborated with designers to translate</w:t>
+      </w:r>
+      <w:r>
+        <w:rPr>
+          <w:rFonts w:cstheme="minorHAnsi"/>
+        </w:rPr>
+        <w:t xml:space="preserve"> 33</w:t>
+      </w:r>
+      <w:r>
+        <w:rPr>
+          <w:rFonts w:cstheme="minorHAnsi"/>
+        </w:rPr>
+        <w:t>+</w:t>
+      </w:r>
+      <w:r>
+        <w:rPr>
+          <w:rFonts w:cstheme="minorHAnsi"/>
+        </w:rPr>
+        <w:t xml:space="preserve"> Figma mockups into pixel-perfect web layouts, achieving 100% design accuracy.</w:t>
       </w:r>
     </w:p>
     <w:p>
@@ -1441,19 +1931,33 @@
         <w:rPr>
           <w:rFonts w:cstheme="minorHAnsi"/>
         </w:rPr>
-        <w:t xml:space="preserve">Deployed and managed </w:t>
-      </w:r>
-      <w:r>
-        <w:rPr>
-          <w:rFonts w:cstheme="minorHAnsi"/>
-        </w:rPr>
-        <w:t>4</w:t>
-      </w:r>
-      <w:r>
-        <w:rPr>
-          <w:rFonts w:cstheme="minorHAnsi"/>
-        </w:rPr>
-        <w:t>+ projects on GitHub Pages and Vercel, enabling real-time previews and faster feedback cycles.</w:t>
+        <w:t>Deployed and managed 4</w:t>
+      </w:r>
+      <w:r>
+        <w:rPr>
+          <w:rFonts w:cstheme="minorHAnsi"/>
+        </w:rPr>
+        <w:t>0</w:t>
+      </w:r>
+      <w:r>
+        <w:rPr>
+          <w:rFonts w:cstheme="minorHAnsi"/>
+        </w:rPr>
+        <w:t xml:space="preserve">+ projects on GitHub Pages and </w:t>
+      </w:r>
+      <w:proofErr w:type="spellStart"/>
+      <w:r>
+        <w:rPr>
+          <w:rFonts w:cstheme="minorHAnsi"/>
+        </w:rPr>
+        <w:t>Vercel</w:t>
+      </w:r>
+      <w:proofErr w:type="spellEnd"/>
+      <w:r>
+        <w:rPr>
+          <w:rFonts w:cstheme="minorHAnsi"/>
+        </w:rPr>
+        <w:t>, enabling real-time previews and faster feedback cycles.</w:t>
       </w:r>
     </w:p>
     <w:p>
@@ -1468,7 +1972,7 @@
           <w:rFonts w:cstheme="minorHAnsi"/>
         </w:rPr>
         <w:pict w14:anchorId="51A8317C">
-          <v:rect id="_x0000_i1266" style="width:0;height:1.5pt" o:hralign="center" o:hrstd="t" o:hr="t" fillcolor="#a0a0a0" stroked="f"/>
+          <v:rect id="_x0000_i1033" style="width:0;height:1.5pt" o:hralign="center" o:hrstd="t" o:hr="t" fillcolor="#a0a0a0" stroked="f"/>
         </w:pict>
       </w:r>
     </w:p>
@@ -1537,7 +2041,21 @@
         <w:rPr>
           <w:rFonts w:cstheme="minorHAnsi"/>
         </w:rPr>
-        <w:t>Familiar with deploying static sites using Vercel.</w:t>
+        <w:t xml:space="preserve">Familiar with deploying static sites using </w:t>
+      </w:r>
+      <w:proofErr w:type="spellStart"/>
+      <w:r>
+        <w:rPr>
+          <w:rFonts w:cstheme="minorHAnsi"/>
+        </w:rPr>
+        <w:t>Vercel</w:t>
+      </w:r>
+      <w:proofErr w:type="spellEnd"/>
+      <w:r>
+        <w:rPr>
+          <w:rFonts w:cstheme="minorHAnsi"/>
+        </w:rPr>
+        <w:t xml:space="preserve"> &amp; Netlify.</w:t>
       </w:r>
     </w:p>
     <w:p>
@@ -1556,6 +2074,7 @@
         <w:rPr>
           <w:rFonts w:cstheme="minorHAnsi"/>
         </w:rPr>
+        <w:lastRenderedPageBreak/>
         <w:t>Enthusiastic about learning new frontend technologies and frameworks.</w:t>
       </w:r>
     </w:p>
@@ -1576,6 +2095,12 @@
           <w:rFonts w:cstheme="minorHAnsi"/>
         </w:rPr>
         <w:t>Attention to detail with a focus on accessibility and responsive design</w:t>
+      </w:r>
+      <w:r>
+        <w:rPr>
+          <w:rFonts w:cstheme="minorHAnsi"/>
+        </w:rPr>
+        <w:t>.</w:t>
       </w:r>
     </w:p>
     <w:p>
@@ -1911,6 +2436,232 @@
     </w:lvl>
   </w:abstractNum>
   <w:abstractNum w:abstractNumId="2" w15:restartNumberingAfterBreak="0">
+    <w:nsid w:val="285B5561"/>
+    <w:multiLevelType w:val="hybridMultilevel"/>
+    <w:tmpl w:val="74869A08"/>
+    <w:lvl w:ilvl="0" w:tplc="04090001">
+      <w:start w:val="1"/>
+      <w:numFmt w:val="bullet"/>
+      <w:lvlText w:val=""/>
+      <w:lvlJc w:val="left"/>
+      <w:pPr>
+        <w:ind w:left="720" w:hanging="360"/>
+      </w:pPr>
+      <w:rPr>
+        <w:rFonts w:ascii="Symbol" w:hAnsi="Symbol" w:hint="default"/>
+      </w:rPr>
+    </w:lvl>
+    <w:lvl w:ilvl="1" w:tplc="04090003" w:tentative="1">
+      <w:start w:val="1"/>
+      <w:numFmt w:val="bullet"/>
+      <w:lvlText w:val="o"/>
+      <w:lvlJc w:val="left"/>
+      <w:pPr>
+        <w:ind w:left="1440" w:hanging="360"/>
+      </w:pPr>
+      <w:rPr>
+        <w:rFonts w:ascii="Courier New" w:hAnsi="Courier New" w:cs="Courier New" w:hint="default"/>
+      </w:rPr>
+    </w:lvl>
+    <w:lvl w:ilvl="2" w:tplc="04090005" w:tentative="1">
+      <w:start w:val="1"/>
+      <w:numFmt w:val="bullet"/>
+      <w:lvlText w:val=""/>
+      <w:lvlJc w:val="left"/>
+      <w:pPr>
+        <w:ind w:left="2160" w:hanging="360"/>
+      </w:pPr>
+      <w:rPr>
+        <w:rFonts w:ascii="Wingdings" w:hAnsi="Wingdings" w:hint="default"/>
+      </w:rPr>
+    </w:lvl>
+    <w:lvl w:ilvl="3" w:tplc="04090001" w:tentative="1">
+      <w:start w:val="1"/>
+      <w:numFmt w:val="bullet"/>
+      <w:lvlText w:val=""/>
+      <w:lvlJc w:val="left"/>
+      <w:pPr>
+        <w:ind w:left="2880" w:hanging="360"/>
+      </w:pPr>
+      <w:rPr>
+        <w:rFonts w:ascii="Symbol" w:hAnsi="Symbol" w:hint="default"/>
+      </w:rPr>
+    </w:lvl>
+    <w:lvl w:ilvl="4" w:tplc="04090003" w:tentative="1">
+      <w:start w:val="1"/>
+      <w:numFmt w:val="bullet"/>
+      <w:lvlText w:val="o"/>
+      <w:lvlJc w:val="left"/>
+      <w:pPr>
+        <w:ind w:left="3600" w:hanging="360"/>
+      </w:pPr>
+      <w:rPr>
+        <w:rFonts w:ascii="Courier New" w:hAnsi="Courier New" w:cs="Courier New" w:hint="default"/>
+      </w:rPr>
+    </w:lvl>
+    <w:lvl w:ilvl="5" w:tplc="04090005" w:tentative="1">
+      <w:start w:val="1"/>
+      <w:numFmt w:val="bullet"/>
+      <w:lvlText w:val=""/>
+      <w:lvlJc w:val="left"/>
+      <w:pPr>
+        <w:ind w:left="4320" w:hanging="360"/>
+      </w:pPr>
+      <w:rPr>
+        <w:rFonts w:ascii="Wingdings" w:hAnsi="Wingdings" w:hint="default"/>
+      </w:rPr>
+    </w:lvl>
+    <w:lvl w:ilvl="6" w:tplc="04090001" w:tentative="1">
+      <w:start w:val="1"/>
+      <w:numFmt w:val="bullet"/>
+      <w:lvlText w:val=""/>
+      <w:lvlJc w:val="left"/>
+      <w:pPr>
+        <w:ind w:left="5040" w:hanging="360"/>
+      </w:pPr>
+      <w:rPr>
+        <w:rFonts w:ascii="Symbol" w:hAnsi="Symbol" w:hint="default"/>
+      </w:rPr>
+    </w:lvl>
+    <w:lvl w:ilvl="7" w:tplc="04090003" w:tentative="1">
+      <w:start w:val="1"/>
+      <w:numFmt w:val="bullet"/>
+      <w:lvlText w:val="o"/>
+      <w:lvlJc w:val="left"/>
+      <w:pPr>
+        <w:ind w:left="5760" w:hanging="360"/>
+      </w:pPr>
+      <w:rPr>
+        <w:rFonts w:ascii="Courier New" w:hAnsi="Courier New" w:cs="Courier New" w:hint="default"/>
+      </w:rPr>
+    </w:lvl>
+    <w:lvl w:ilvl="8" w:tplc="04090005" w:tentative="1">
+      <w:start w:val="1"/>
+      <w:numFmt w:val="bullet"/>
+      <w:lvlText w:val=""/>
+      <w:lvlJc w:val="left"/>
+      <w:pPr>
+        <w:ind w:left="6480" w:hanging="360"/>
+      </w:pPr>
+      <w:rPr>
+        <w:rFonts w:ascii="Wingdings" w:hAnsi="Wingdings" w:hint="default"/>
+      </w:rPr>
+    </w:lvl>
+  </w:abstractNum>
+  <w:abstractNum w:abstractNumId="3" w15:restartNumberingAfterBreak="0">
+    <w:nsid w:val="3599784E"/>
+    <w:multiLevelType w:val="hybridMultilevel"/>
+    <w:tmpl w:val="155CE5CA"/>
+    <w:lvl w:ilvl="0" w:tplc="04090001">
+      <w:start w:val="1"/>
+      <w:numFmt w:val="bullet"/>
+      <w:lvlText w:val=""/>
+      <w:lvlJc w:val="left"/>
+      <w:pPr>
+        <w:ind w:left="720" w:hanging="360"/>
+      </w:pPr>
+      <w:rPr>
+        <w:rFonts w:ascii="Symbol" w:hAnsi="Symbol" w:hint="default"/>
+      </w:rPr>
+    </w:lvl>
+    <w:lvl w:ilvl="1" w:tplc="04090003" w:tentative="1">
+      <w:start w:val="1"/>
+      <w:numFmt w:val="bullet"/>
+      <w:lvlText w:val="o"/>
+      <w:lvlJc w:val="left"/>
+      <w:pPr>
+        <w:ind w:left="1440" w:hanging="360"/>
+      </w:pPr>
+      <w:rPr>
+        <w:rFonts w:ascii="Courier New" w:hAnsi="Courier New" w:cs="Courier New" w:hint="default"/>
+      </w:rPr>
+    </w:lvl>
+    <w:lvl w:ilvl="2" w:tplc="04090005" w:tentative="1">
+      <w:start w:val="1"/>
+      <w:numFmt w:val="bullet"/>
+      <w:lvlText w:val=""/>
+      <w:lvlJc w:val="left"/>
+      <w:pPr>
+        <w:ind w:left="2160" w:hanging="360"/>
+      </w:pPr>
+      <w:rPr>
+        <w:rFonts w:ascii="Wingdings" w:hAnsi="Wingdings" w:hint="default"/>
+      </w:rPr>
+    </w:lvl>
+    <w:lvl w:ilvl="3" w:tplc="04090001" w:tentative="1">
+      <w:start w:val="1"/>
+      <w:numFmt w:val="bullet"/>
+      <w:lvlText w:val=""/>
+      <w:lvlJc w:val="left"/>
+      <w:pPr>
+        <w:ind w:left="2880" w:hanging="360"/>
+      </w:pPr>
+      <w:rPr>
+        <w:rFonts w:ascii="Symbol" w:hAnsi="Symbol" w:hint="default"/>
+      </w:rPr>
+    </w:lvl>
+    <w:lvl w:ilvl="4" w:tplc="04090003" w:tentative="1">
+      <w:start w:val="1"/>
+      <w:numFmt w:val="bullet"/>
+      <w:lvlText w:val="o"/>
+      <w:lvlJc w:val="left"/>
+      <w:pPr>
+        <w:ind w:left="3600" w:hanging="360"/>
+      </w:pPr>
+      <w:rPr>
+        <w:rFonts w:ascii="Courier New" w:hAnsi="Courier New" w:cs="Courier New" w:hint="default"/>
+      </w:rPr>
+    </w:lvl>
+    <w:lvl w:ilvl="5" w:tplc="04090005" w:tentative="1">
+      <w:start w:val="1"/>
+      <w:numFmt w:val="bullet"/>
+      <w:lvlText w:val=""/>
+      <w:lvlJc w:val="left"/>
+      <w:pPr>
+        <w:ind w:left="4320" w:hanging="360"/>
+      </w:pPr>
+      <w:rPr>
+        <w:rFonts w:ascii="Wingdings" w:hAnsi="Wingdings" w:hint="default"/>
+      </w:rPr>
+    </w:lvl>
+    <w:lvl w:ilvl="6" w:tplc="04090001" w:tentative="1">
+      <w:start w:val="1"/>
+      <w:numFmt w:val="bullet"/>
+      <w:lvlText w:val=""/>
+      <w:lvlJc w:val="left"/>
+      <w:pPr>
+        <w:ind w:left="5040" w:hanging="360"/>
+      </w:pPr>
+      <w:rPr>
+        <w:rFonts w:ascii="Symbol" w:hAnsi="Symbol" w:hint="default"/>
+      </w:rPr>
+    </w:lvl>
+    <w:lvl w:ilvl="7" w:tplc="04090003" w:tentative="1">
+      <w:start w:val="1"/>
+      <w:numFmt w:val="bullet"/>
+      <w:lvlText w:val="o"/>
+      <w:lvlJc w:val="left"/>
+      <w:pPr>
+        <w:ind w:left="5760" w:hanging="360"/>
+      </w:pPr>
+      <w:rPr>
+        <w:rFonts w:ascii="Courier New" w:hAnsi="Courier New" w:cs="Courier New" w:hint="default"/>
+      </w:rPr>
+    </w:lvl>
+    <w:lvl w:ilvl="8" w:tplc="04090005" w:tentative="1">
+      <w:start w:val="1"/>
+      <w:numFmt w:val="bullet"/>
+      <w:lvlText w:val=""/>
+      <w:lvlJc w:val="left"/>
+      <w:pPr>
+        <w:ind w:left="6480" w:hanging="360"/>
+      </w:pPr>
+      <w:rPr>
+        <w:rFonts w:ascii="Wingdings" w:hAnsi="Wingdings" w:hint="default"/>
+      </w:rPr>
+    </w:lvl>
+  </w:abstractNum>
+  <w:abstractNum w:abstractNumId="4" w15:restartNumberingAfterBreak="0">
     <w:nsid w:val="433639B7"/>
     <w:multiLevelType w:val="multilevel"/>
     <w:tmpl w:val="433639B7"/>
@@ -2059,7 +2810,7 @@
       </w:rPr>
     </w:lvl>
   </w:abstractNum>
-  <w:abstractNum w:abstractNumId="3" w15:restartNumberingAfterBreak="0">
+  <w:abstractNum w:abstractNumId="5" w15:restartNumberingAfterBreak="0">
     <w:nsid w:val="4CB6365A"/>
     <w:multiLevelType w:val="multilevel"/>
     <w:tmpl w:val="C082D944"/>
@@ -2208,7 +2959,7 @@
       </w:rPr>
     </w:lvl>
   </w:abstractNum>
-  <w:abstractNum w:abstractNumId="4" w15:restartNumberingAfterBreak="0">
+  <w:abstractNum w:abstractNumId="6" w15:restartNumberingAfterBreak="0">
     <w:nsid w:val="4D7D694F"/>
     <w:multiLevelType w:val="multilevel"/>
     <w:tmpl w:val="B590D95A"/>
@@ -2357,7 +3108,7 @@
       </w:rPr>
     </w:lvl>
   </w:abstractNum>
-  <w:abstractNum w:abstractNumId="5" w15:restartNumberingAfterBreak="0">
+  <w:abstractNum w:abstractNumId="7" w15:restartNumberingAfterBreak="0">
     <w:nsid w:val="552523CC"/>
     <w:multiLevelType w:val="multilevel"/>
     <w:tmpl w:val="552523CC"/>
@@ -2470,7 +3221,7 @@
       </w:rPr>
     </w:lvl>
   </w:abstractNum>
-  <w:abstractNum w:abstractNumId="6" w15:restartNumberingAfterBreak="0">
+  <w:abstractNum w:abstractNumId="8" w15:restartNumberingAfterBreak="0">
     <w:nsid w:val="590E36AD"/>
     <w:multiLevelType w:val="multilevel"/>
     <w:tmpl w:val="590E36AD"/>
@@ -2583,7 +3334,120 @@
       </w:rPr>
     </w:lvl>
   </w:abstractNum>
-  <w:abstractNum w:abstractNumId="7" w15:restartNumberingAfterBreak="0">
+  <w:abstractNum w:abstractNumId="9" w15:restartNumberingAfterBreak="0">
+    <w:nsid w:val="5BB16CE1"/>
+    <w:multiLevelType w:val="hybridMultilevel"/>
+    <w:tmpl w:val="9A147536"/>
+    <w:lvl w:ilvl="0" w:tplc="04090001">
+      <w:start w:val="1"/>
+      <w:numFmt w:val="bullet"/>
+      <w:lvlText w:val=""/>
+      <w:lvlJc w:val="left"/>
+      <w:pPr>
+        <w:ind w:left="720" w:hanging="360"/>
+      </w:pPr>
+      <w:rPr>
+        <w:rFonts w:ascii="Symbol" w:hAnsi="Symbol" w:hint="default"/>
+      </w:rPr>
+    </w:lvl>
+    <w:lvl w:ilvl="1" w:tplc="04090003" w:tentative="1">
+      <w:start w:val="1"/>
+      <w:numFmt w:val="bullet"/>
+      <w:lvlText w:val="o"/>
+      <w:lvlJc w:val="left"/>
+      <w:pPr>
+        <w:ind w:left="1440" w:hanging="360"/>
+      </w:pPr>
+      <w:rPr>
+        <w:rFonts w:ascii="Courier New" w:hAnsi="Courier New" w:cs="Courier New" w:hint="default"/>
+      </w:rPr>
+    </w:lvl>
+    <w:lvl w:ilvl="2" w:tplc="04090005" w:tentative="1">
+      <w:start w:val="1"/>
+      <w:numFmt w:val="bullet"/>
+      <w:lvlText w:val=""/>
+      <w:lvlJc w:val="left"/>
+      <w:pPr>
+        <w:ind w:left="2160" w:hanging="360"/>
+      </w:pPr>
+      <w:rPr>
+        <w:rFonts w:ascii="Wingdings" w:hAnsi="Wingdings" w:hint="default"/>
+      </w:rPr>
+    </w:lvl>
+    <w:lvl w:ilvl="3" w:tplc="04090001" w:tentative="1">
+      <w:start w:val="1"/>
+      <w:numFmt w:val="bullet"/>
+      <w:lvlText w:val=""/>
+      <w:lvlJc w:val="left"/>
+      <w:pPr>
+        <w:ind w:left="2880" w:hanging="360"/>
+      </w:pPr>
+      <w:rPr>
+        <w:rFonts w:ascii="Symbol" w:hAnsi="Symbol" w:hint="default"/>
+      </w:rPr>
+    </w:lvl>
+    <w:lvl w:ilvl="4" w:tplc="04090003" w:tentative="1">
+      <w:start w:val="1"/>
+      <w:numFmt w:val="bullet"/>
+      <w:lvlText w:val="o"/>
+      <w:lvlJc w:val="left"/>
+      <w:pPr>
+        <w:ind w:left="3600" w:hanging="360"/>
+      </w:pPr>
+      <w:rPr>
+        <w:rFonts w:ascii="Courier New" w:hAnsi="Courier New" w:cs="Courier New" w:hint="default"/>
+      </w:rPr>
+    </w:lvl>
+    <w:lvl w:ilvl="5" w:tplc="04090005" w:tentative="1">
+      <w:start w:val="1"/>
+      <w:numFmt w:val="bullet"/>
+      <w:lvlText w:val=""/>
+      <w:lvlJc w:val="left"/>
+      <w:pPr>
+        <w:ind w:left="4320" w:hanging="360"/>
+      </w:pPr>
+      <w:rPr>
+        <w:rFonts w:ascii="Wingdings" w:hAnsi="Wingdings" w:hint="default"/>
+      </w:rPr>
+    </w:lvl>
+    <w:lvl w:ilvl="6" w:tplc="04090001" w:tentative="1">
+      <w:start w:val="1"/>
+      <w:numFmt w:val="bullet"/>
+      <w:lvlText w:val=""/>
+      <w:lvlJc w:val="left"/>
+      <w:pPr>
+        <w:ind w:left="5040" w:hanging="360"/>
+      </w:pPr>
+      <w:rPr>
+        <w:rFonts w:ascii="Symbol" w:hAnsi="Symbol" w:hint="default"/>
+      </w:rPr>
+    </w:lvl>
+    <w:lvl w:ilvl="7" w:tplc="04090003" w:tentative="1">
+      <w:start w:val="1"/>
+      <w:numFmt w:val="bullet"/>
+      <w:lvlText w:val="o"/>
+      <w:lvlJc w:val="left"/>
+      <w:pPr>
+        <w:ind w:left="5760" w:hanging="360"/>
+      </w:pPr>
+      <w:rPr>
+        <w:rFonts w:ascii="Courier New" w:hAnsi="Courier New" w:cs="Courier New" w:hint="default"/>
+      </w:rPr>
+    </w:lvl>
+    <w:lvl w:ilvl="8" w:tplc="04090005" w:tentative="1">
+      <w:start w:val="1"/>
+      <w:numFmt w:val="bullet"/>
+      <w:lvlText w:val=""/>
+      <w:lvlJc w:val="left"/>
+      <w:pPr>
+        <w:ind w:left="6480" w:hanging="360"/>
+      </w:pPr>
+      <w:rPr>
+        <w:rFonts w:ascii="Wingdings" w:hAnsi="Wingdings" w:hint="default"/>
+      </w:rPr>
+    </w:lvl>
+  </w:abstractNum>
+  <w:abstractNum w:abstractNumId="10" w15:restartNumberingAfterBreak="0">
     <w:nsid w:val="639E7F13"/>
     <w:multiLevelType w:val="multilevel"/>
     <w:tmpl w:val="9CEA51CC"/>
@@ -2732,7 +3596,7 @@
       </w:rPr>
     </w:lvl>
   </w:abstractNum>
-  <w:abstractNum w:abstractNumId="8" w15:restartNumberingAfterBreak="0">
+  <w:abstractNum w:abstractNumId="11" w15:restartNumberingAfterBreak="0">
     <w:nsid w:val="67910070"/>
     <w:multiLevelType w:val="hybridMultilevel"/>
     <w:tmpl w:val="EF4E21A2"/>
@@ -2845,7 +3709,7 @@
       </w:rPr>
     </w:lvl>
   </w:abstractNum>
-  <w:abstractNum w:abstractNumId="9" w15:restartNumberingAfterBreak="0">
+  <w:abstractNum w:abstractNumId="12" w15:restartNumberingAfterBreak="0">
     <w:nsid w:val="7FBA45F8"/>
     <w:multiLevelType w:val="multilevel"/>
     <w:tmpl w:val="E500B640"/>
@@ -2995,34 +3859,43 @@
     </w:lvl>
   </w:abstractNum>
   <w:num w:numId="1" w16cid:durableId="1531183665">
-    <w:abstractNumId w:val="5"/>
+    <w:abstractNumId w:val="7"/>
   </w:num>
   <w:num w:numId="2" w16cid:durableId="656034914">
-    <w:abstractNumId w:val="2"/>
+    <w:abstractNumId w:val="4"/>
   </w:num>
   <w:num w:numId="3" w16cid:durableId="11610248">
-    <w:abstractNumId w:val="7"/>
+    <w:abstractNumId w:val="10"/>
   </w:num>
   <w:num w:numId="4" w16cid:durableId="1890917117">
-    <w:abstractNumId w:val="6"/>
+    <w:abstractNumId w:val="8"/>
   </w:num>
   <w:num w:numId="5" w16cid:durableId="281108362">
     <w:abstractNumId w:val="1"/>
   </w:num>
   <w:num w:numId="6" w16cid:durableId="2056199705">
-    <w:abstractNumId w:val="4"/>
+    <w:abstractNumId w:val="6"/>
   </w:num>
   <w:num w:numId="7" w16cid:durableId="1221556673">
-    <w:abstractNumId w:val="3"/>
+    <w:abstractNumId w:val="5"/>
   </w:num>
   <w:num w:numId="8" w16cid:durableId="362441859">
-    <w:abstractNumId w:val="9"/>
+    <w:abstractNumId w:val="12"/>
   </w:num>
   <w:num w:numId="9" w16cid:durableId="1004822409">
-    <w:abstractNumId w:val="8"/>
+    <w:abstractNumId w:val="11"/>
   </w:num>
   <w:num w:numId="10" w16cid:durableId="499538996">
     <w:abstractNumId w:val="0"/>
+  </w:num>
+  <w:num w:numId="11" w16cid:durableId="955720663">
+    <w:abstractNumId w:val="2"/>
+  </w:num>
+  <w:num w:numId="12" w16cid:durableId="614336796">
+    <w:abstractNumId w:val="3"/>
+  </w:num>
+  <w:num w:numId="13" w16cid:durableId="1084063491">
+    <w:abstractNumId w:val="9"/>
   </w:num>
 </w:numbering>
 </file>
@@ -3347,6 +4220,7 @@
   <w:style w:type="character" w:default="1" w:styleId="DefaultParagraphFont">
     <w:name w:val="Default Paragraph Font"/>
     <w:uiPriority w:val="1"/>
+    <w:semiHidden/>
     <w:unhideWhenUsed/>
   </w:style>
   <w:style w:type="table" w:default="1" w:styleId="TableNormal">

</xml_diff>

<commit_message>
added google verification file
</commit_message>
<xml_diff>
--- a/src/assets/CV/Arumemi_Michelle_Webdev_CV.docx
+++ b/src/assets/CV/Arumemi_Michelle_Webdev_CV.docx
@@ -107,7 +107,6 @@
         <w:t xml:space="preserve"> </w:t>
       </w:r>
       <w:hyperlink r:id="rId8" w:history="1">
-        <w:proofErr w:type="spellStart"/>
         <w:r>
           <w:rPr>
             <w:rStyle w:val="Hyperlink"/>
@@ -115,7 +114,6 @@
           </w:rPr>
           <w:t>Github</w:t>
         </w:r>
-        <w:proofErr w:type="spellEnd"/>
       </w:hyperlink>
       <w:r>
         <w:rPr>
@@ -152,7 +150,7 @@
           <w:rFonts w:cstheme="minorHAnsi"/>
         </w:rPr>
         <w:pict w14:anchorId="5023F592">
-          <v:rect id="_x0000_i1025" style="width:0;height:1.5pt" o:hralign="center" o:hrstd="t" o:hr="t" fillcolor="#a0a0a0" stroked="f"/>
+          <v:rect id="_x0000_i1041" style="width:0;height:1.5pt" o:hralign="center" o:hrstd="t" o:hr="t" fillcolor="#a0a0a0" stroked="f"/>
         </w:pict>
       </w:r>
     </w:p>
@@ -189,7 +187,19 @@
         <w:rPr>
           <w:rFonts w:cstheme="minorHAnsi"/>
         </w:rPr>
-        <w:t>Full-Stack Developer with 4+ years of experience building responsive, SEO-optimized web</w:t>
+        <w:t>Full-Stack Developer with 4+ years of experience building responsive, S</w:t>
+      </w:r>
+      <w:r>
+        <w:rPr>
+          <w:rFonts w:cstheme="minorHAnsi"/>
+        </w:rPr>
+        <w:t>EO optimized</w:t>
+      </w:r>
+      <w:r>
+        <w:rPr>
+          <w:rFonts w:cstheme="minorHAnsi"/>
+        </w:rPr>
+        <w:t xml:space="preserve"> web</w:t>
       </w:r>
       <w:r>
         <w:rPr>
@@ -207,16 +217,14 @@
         <w:rPr>
           <w:rFonts w:cstheme="minorHAnsi"/>
         </w:rPr>
-        <w:t xml:space="preserve"> </w:t>
-      </w:r>
-      <w:proofErr w:type="spellStart"/>
-      <w:r>
-        <w:rPr>
-          <w:rFonts w:cstheme="minorHAnsi"/>
-        </w:rPr>
-        <w:t>NestJs</w:t>
-      </w:r>
-      <w:proofErr w:type="spellEnd"/>
+        <w:t xml:space="preserve"> NestJ</w:t>
+      </w:r>
+      <w:r>
+        <w:rPr>
+          <w:rFonts w:cstheme="minorHAnsi"/>
+        </w:rPr>
+        <w:t>S</w:t>
+      </w:r>
       <w:r>
         <w:rPr>
           <w:rFonts w:cstheme="minorHAnsi"/>
@@ -227,7 +235,7 @@
         <w:rPr>
           <w:rFonts w:cstheme="minorHAnsi"/>
         </w:rPr>
-        <w:t xml:space="preserve"> Vue, and Bootstrap for frontend development, with strong backend expertise in Node.js, Express.js, PHP, MySQL, and MongoDB. Experienced in translating Figma and PSD designs into pixel-perfect, cross-browser compatible interfaces using media queries and responsive design principles. Skilled in WordPress theme and plugin development, with hands-on experience on Shopify, BigCommerce, and Magento platforms. Proficient with Git/SVN version control, Chrome DevTools debugging, and AI-assisted development tools including GitHub Copilot and Cursor. Adept at managing multiple projects under tight deadlines with strong attention to detail and clear communication.</w:t>
+        <w:t xml:space="preserve"> Vue, and Bootstrap for frontend development, with strong backend expertise in Node.js, Express.js, PHP, MySQL, and MongoDB. Experienced in translating Figma and PSD designs into pixel-perfect, cross-browser compatible interfaces. Skilled in WordPress theme and plugin development, with hands-on experience on Shopify, BigCommerce, and Magento platforms. Proficient with Git version control, Chrome DevTools debugging, and AI-assisted development tools including GitHub Copilot and Cursor. Adept at managing multiple projects under tight deadlines with strong attention to detail.</w:t>
       </w:r>
       <w:r>
         <w:rPr>
@@ -538,18 +546,8 @@
           <w:sz w:val="22"/>
           <w:szCs w:val="22"/>
         </w:rPr>
-        <w:t xml:space="preserve">Deployed and maintained projects on </w:t>
-      </w:r>
-      <w:proofErr w:type="spellStart"/>
-      <w:r>
-        <w:rPr>
-          <w:rFonts w:asciiTheme="minorHAnsi" w:hAnsiTheme="minorHAnsi" w:cstheme="minorHAnsi"/>
-          <w:sz w:val="22"/>
-          <w:szCs w:val="22"/>
-        </w:rPr>
-        <w:t>Vercel</w:t>
-      </w:r>
-      <w:proofErr w:type="spellEnd"/>
+        <w:t>Deployed and maintained projects on Vercel</w:t>
+      </w:r>
       <w:r>
         <w:rPr>
           <w:rFonts w:asciiTheme="minorHAnsi" w:hAnsiTheme="minorHAnsi" w:cstheme="minorHAnsi"/>
@@ -698,7 +696,6 @@
         <w:t xml:space="preserve">Personal Portfolio Website </w:t>
       </w:r>
       <w:hyperlink r:id="rId11" w:history="1">
-        <w:proofErr w:type="spellStart"/>
         <w:r>
           <w:rPr>
             <w:rStyle w:val="Hyperlink"/>
@@ -708,7 +705,6 @@
           </w:rPr>
           <w:t>Github</w:t>
         </w:r>
-        <w:proofErr w:type="spellEnd"/>
       </w:hyperlink>
       <w:r>
         <w:rPr>
@@ -775,21 +771,7 @@
         </w:rPr>
         <w:lastRenderedPageBreak/>
         <w:tab/>
-        <w:t xml:space="preserve">Tech stack: Html, </w:t>
-      </w:r>
-      <w:proofErr w:type="spellStart"/>
-      <w:r>
-        <w:rPr>
-          <w:rFonts w:cstheme="minorHAnsi"/>
-        </w:rPr>
-        <w:t>Css</w:t>
-      </w:r>
-      <w:proofErr w:type="spellEnd"/>
-      <w:r>
-        <w:rPr>
-          <w:rFonts w:cstheme="minorHAnsi"/>
-        </w:rPr>
-        <w:t>, JavaScript.</w:t>
+        <w:t>Tech stack: Html, Css, JavaScript.</w:t>
       </w:r>
     </w:p>
     <w:p>
@@ -827,7 +809,6 @@
         <w:tab/>
       </w:r>
       <w:hyperlink r:id="rId13" w:history="1">
-        <w:proofErr w:type="spellStart"/>
         <w:r>
           <w:rPr>
             <w:rStyle w:val="Hyperlink"/>
@@ -835,9 +816,129 @@
             <w:b/>
             <w:bCs/>
           </w:rPr>
-          <w:t>Github</w:t>
+          <w:t>Github Link</w:t>
         </w:r>
-        <w:proofErr w:type="spellEnd"/>
+      </w:hyperlink>
+      <w:r>
+        <w:rPr>
+          <w:rFonts w:cstheme="minorHAnsi"/>
+          <w:b/>
+          <w:bCs/>
+        </w:rPr>
+        <w:t xml:space="preserve"> | </w:t>
+      </w:r>
+      <w:r>
+        <w:rPr>
+          <w:rFonts w:cstheme="minorHAnsi"/>
+          <w:b/>
+          <w:bCs/>
+        </w:rPr>
+        <w:fldChar w:fldCharType="begin"/>
+      </w:r>
+      <w:r>
+        <w:rPr>
+          <w:rFonts w:cstheme="minorHAnsi"/>
+          <w:b/>
+          <w:bCs/>
+        </w:rPr>
+        <w:instrText>HYPERLINK "https://nexus-wine-theta.vercel.app/"</w:instrText>
+      </w:r>
+      <w:r>
+        <w:rPr>
+          <w:rFonts w:cstheme="minorHAnsi"/>
+          <w:b/>
+          <w:bCs/>
+        </w:rPr>
+      </w:r>
+      <w:r>
+        <w:rPr>
+          <w:rFonts w:cstheme="minorHAnsi"/>
+          <w:b/>
+          <w:bCs/>
+        </w:rPr>
+        <w:fldChar w:fldCharType="separate"/>
+      </w:r>
+      <w:r>
+        <w:rPr>
+          <w:rStyle w:val="Hyperlink"/>
+          <w:rFonts w:cstheme="minorHAnsi"/>
+          <w:b/>
+          <w:bCs/>
+        </w:rPr>
+        <w:t>Live Link</w:t>
+      </w:r>
+    </w:p>
+    <w:p>
+      <w:pPr>
+        <w:ind w:left="90"/>
+        <w:rPr>
+          <w:rFonts w:cstheme="minorHAnsi"/>
+        </w:rPr>
+      </w:pPr>
+      <w:r>
+        <w:rPr>
+          <w:rFonts w:cstheme="minorHAnsi"/>
+          <w:b/>
+          <w:bCs/>
+        </w:rPr>
+        <w:fldChar w:fldCharType="end"/>
+      </w:r>
+      <w:r>
+        <w:rPr>
+          <w:rFonts w:cstheme="minorHAnsi"/>
+        </w:rPr>
+        <w:t>A modern, powerful business intelligence dashboard built with React, Tailwind CSS, and                     Recharts. Nexus provides comprehensive business analytics, customer management, inventory tracking, and reporting tools in a beautiful, responsive interface.</w:t>
+      </w:r>
+    </w:p>
+    <w:p>
+      <w:pPr>
+        <w:ind w:left="90"/>
+        <w:rPr>
+          <w:rFonts w:cstheme="minorHAnsi"/>
+        </w:rPr>
+      </w:pPr>
+      <w:r>
+        <w:rPr>
+          <w:rFonts w:cstheme="minorHAnsi"/>
+        </w:rPr>
+        <w:t>Tech stack: React, Tailwind Css</w:t>
+      </w:r>
+      <w:r>
+        <w:rPr>
+          <w:rFonts w:cstheme="minorHAnsi"/>
+        </w:rPr>
+        <w:t>.</w:t>
+      </w:r>
+    </w:p>
+    <w:p>
+      <w:pPr>
+        <w:pStyle w:val="ListParagraph"/>
+        <w:numPr>
+          <w:ilvl w:val="0"/>
+          <w:numId w:val="10"/>
+        </w:numPr>
+        <w:ind w:left="90" w:hanging="90"/>
+        <w:rPr>
+          <w:rFonts w:cstheme="minorHAnsi"/>
+        </w:rPr>
+      </w:pPr>
+      <w:r>
+        <w:rPr>
+          <w:rFonts w:cstheme="minorHAnsi"/>
+          <w:b/>
+          <w:bCs/>
+        </w:rPr>
+        <w:t>ZORIEJẸUN</w:t>
+      </w:r>
+      <w:r>
+        <w:rPr>
+          <w:rFonts w:cstheme="minorHAnsi"/>
+          <w:b/>
+          <w:bCs/>
+        </w:rPr>
+        <w:tab/>
+      </w:r>
+      <w:hyperlink r:id="rId14" w:history="1">
         <w:r>
           <w:rPr>
             <w:rStyle w:val="Hyperlink"/>
@@ -845,156 +946,7 @@
             <w:b/>
             <w:bCs/>
           </w:rPr>
-          <w:t xml:space="preserve"> Link</w:t>
-        </w:r>
-      </w:hyperlink>
-      <w:r>
-        <w:rPr>
-          <w:rFonts w:cstheme="minorHAnsi"/>
-          <w:b/>
-          <w:bCs/>
-        </w:rPr>
-        <w:t xml:space="preserve"> | </w:t>
-      </w:r>
-      <w:r>
-        <w:rPr>
-          <w:rFonts w:cstheme="minorHAnsi"/>
-          <w:b/>
-          <w:bCs/>
-        </w:rPr>
-        <w:fldChar w:fldCharType="begin"/>
-      </w:r>
-      <w:r>
-        <w:rPr>
-          <w:rFonts w:cstheme="minorHAnsi"/>
-          <w:b/>
-          <w:bCs/>
-        </w:rPr>
-        <w:instrText>HYPERLINK "https://nexus-wine-theta.vercel.app/"</w:instrText>
-      </w:r>
-      <w:r>
-        <w:rPr>
-          <w:rFonts w:cstheme="minorHAnsi"/>
-          <w:b/>
-          <w:bCs/>
-        </w:rPr>
-      </w:r>
-      <w:r>
-        <w:rPr>
-          <w:rFonts w:cstheme="minorHAnsi"/>
-          <w:b/>
-          <w:bCs/>
-        </w:rPr>
-        <w:fldChar w:fldCharType="separate"/>
-      </w:r>
-      <w:r>
-        <w:rPr>
-          <w:rStyle w:val="Hyperlink"/>
-          <w:rFonts w:cstheme="minorHAnsi"/>
-          <w:b/>
-          <w:bCs/>
-        </w:rPr>
-        <w:t>Live Link</w:t>
-      </w:r>
-    </w:p>
-    <w:p>
-      <w:pPr>
-        <w:ind w:left="90"/>
-        <w:rPr>
-          <w:rFonts w:cstheme="minorHAnsi"/>
-        </w:rPr>
-      </w:pPr>
-      <w:r>
-        <w:rPr>
-          <w:rFonts w:cstheme="minorHAnsi"/>
-          <w:b/>
-          <w:bCs/>
-        </w:rPr>
-        <w:fldChar w:fldCharType="end"/>
-      </w:r>
-      <w:r>
-        <w:rPr>
-          <w:rFonts w:cstheme="minorHAnsi"/>
-        </w:rPr>
-        <w:t>A modern, powerful business intelligence dashboard built with React, Tailwind CSS, and                     Recharts. Nexus provides comprehensive business analytics, customer management, inventory tracking, and reporting tools in a beautiful, responsive interface.</w:t>
-      </w:r>
-    </w:p>
-    <w:p>
-      <w:pPr>
-        <w:ind w:left="90"/>
-        <w:rPr>
-          <w:rFonts w:cstheme="minorHAnsi"/>
-        </w:rPr>
-      </w:pPr>
-      <w:r>
-        <w:rPr>
-          <w:rFonts w:cstheme="minorHAnsi"/>
-        </w:rPr>
-        <w:t xml:space="preserve">Tech stack: React, Tailwind </w:t>
-      </w:r>
-      <w:proofErr w:type="spellStart"/>
-      <w:r>
-        <w:rPr>
-          <w:rFonts w:cstheme="minorHAnsi"/>
-        </w:rPr>
-        <w:t>Css</w:t>
-      </w:r>
-      <w:proofErr w:type="spellEnd"/>
-      <w:r>
-        <w:rPr>
-          <w:rFonts w:cstheme="minorHAnsi"/>
-        </w:rPr>
-        <w:t>.</w:t>
-      </w:r>
-    </w:p>
-    <w:p>
-      <w:pPr>
-        <w:pStyle w:val="ListParagraph"/>
-        <w:numPr>
-          <w:ilvl w:val="0"/>
-          <w:numId w:val="10"/>
-        </w:numPr>
-        <w:ind w:left="90" w:hanging="90"/>
-        <w:rPr>
-          <w:rFonts w:cstheme="minorHAnsi"/>
-        </w:rPr>
-      </w:pPr>
-      <w:r>
-        <w:rPr>
-          <w:rFonts w:cstheme="minorHAnsi"/>
-          <w:b/>
-          <w:bCs/>
-        </w:rPr>
-        <w:t>ZORIEJẸUN</w:t>
-      </w:r>
-      <w:r>
-        <w:rPr>
-          <w:rFonts w:cstheme="minorHAnsi"/>
-          <w:b/>
-          <w:bCs/>
-        </w:rPr>
-        <w:tab/>
-      </w:r>
-      <w:hyperlink r:id="rId14" w:history="1">
-        <w:proofErr w:type="spellStart"/>
-        <w:r>
-          <w:rPr>
-            <w:rStyle w:val="Hyperlink"/>
-            <w:rFonts w:cstheme="minorHAnsi"/>
-            <w:b/>
-            <w:bCs/>
-          </w:rPr>
-          <w:t>Github</w:t>
-        </w:r>
-        <w:proofErr w:type="spellEnd"/>
-        <w:r>
-          <w:rPr>
-            <w:rStyle w:val="Hyperlink"/>
-            <w:rFonts w:cstheme="minorHAnsi"/>
-            <w:b/>
-            <w:bCs/>
-          </w:rPr>
-          <w:t xml:space="preserve"> Link</w:t>
+          <w:t>Github Link</w:t>
         </w:r>
       </w:hyperlink>
       <w:r>
@@ -1094,21 +1046,7 @@
         <w:rPr>
           <w:rFonts w:cstheme="minorHAnsi"/>
         </w:rPr>
-        <w:t xml:space="preserve">Tech stack: Html, </w:t>
-      </w:r>
-      <w:proofErr w:type="spellStart"/>
-      <w:r>
-        <w:rPr>
-          <w:rFonts w:cstheme="minorHAnsi"/>
-        </w:rPr>
-        <w:t>Css</w:t>
-      </w:r>
-      <w:proofErr w:type="spellEnd"/>
-      <w:r>
-        <w:rPr>
-          <w:rFonts w:cstheme="minorHAnsi"/>
-        </w:rPr>
-        <w:t>, JavaScript</w:t>
+        <w:t>Tech stack: Html, Css, JavaScript</w:t>
       </w:r>
     </w:p>
     <w:p>
@@ -1125,23 +1063,13 @@
           <w:bCs/>
         </w:rPr>
       </w:pPr>
-      <w:proofErr w:type="spellStart"/>
       <w:r>
         <w:rPr>
           <w:rFonts w:cstheme="minorHAnsi"/>
           <w:b/>
           <w:bCs/>
         </w:rPr>
-        <w:t>SmartLiving</w:t>
-      </w:r>
-      <w:proofErr w:type="spellEnd"/>
-      <w:r>
-        <w:rPr>
-          <w:rFonts w:cstheme="minorHAnsi"/>
-          <w:b/>
-          <w:bCs/>
-        </w:rPr>
-        <w:t xml:space="preserve"> </w:t>
+        <w:t xml:space="preserve">SmartLiving </w:t>
       </w:r>
       <w:r>
         <w:rPr>
@@ -1189,19 +1117,11 @@
           <w:rFonts w:cstheme="minorHAnsi"/>
         </w:rPr>
       </w:pPr>
-      <w:proofErr w:type="spellStart"/>
-      <w:r>
-        <w:rPr>
-          <w:rFonts w:cstheme="minorHAnsi"/>
-        </w:rPr>
-        <w:t>SmartLiving</w:t>
-      </w:r>
-      <w:proofErr w:type="spellEnd"/>
-      <w:r>
-        <w:rPr>
-          <w:rFonts w:cstheme="minorHAnsi"/>
-        </w:rPr>
-        <w:t xml:space="preserve"> is a premium, high-tech platform designed to bridge the gap between real estate and the Internet of Things (IoT). It's built with a sleek, futuristic interface and it provides users with a central ecosystem to discover, manage, and automate smart properties.</w:t>
+      <w:r>
+        <w:rPr>
+          <w:rFonts w:cstheme="minorHAnsi"/>
+        </w:rPr>
+        <w:t>SmartLiving is a premium, high-tech platform designed to bridge the gap between real estate and the Internet of Things (IoT). It's built with a sleek, futuristic interface and it provides users with a central ecosystem to discover, manage, and automate smart properties.</w:t>
       </w:r>
     </w:p>
     <w:p>
@@ -1513,115 +1433,6 @@
     </w:p>
     <w:p>
       <w:pPr>
-        <w:ind w:left="90" w:hanging="90"/>
-        <w:rPr>
-          <w:rFonts w:cstheme="minorHAnsi"/>
-        </w:rPr>
-      </w:pPr>
-      <w:r>
-        <w:rPr>
-          <w:rFonts w:cstheme="minorHAnsi"/>
-        </w:rPr>
-        <w:pict w14:anchorId="07E1956C">
-          <v:rect id="_x0000_i1029" style="width:0;height:1.5pt" o:hralign="center" o:hrstd="t" o:hr="t" fillcolor="#a0a0a0" stroked="f"/>
-        </w:pict>
-      </w:r>
-    </w:p>
-    <w:p>
-      <w:pPr>
-        <w:ind w:left="90" w:hanging="90"/>
-        <w:rPr>
-          <w:rFonts w:cstheme="minorHAnsi"/>
-          <w:b/>
-          <w:bCs/>
-          <w:sz w:val="28"/>
-          <w:szCs w:val="28"/>
-        </w:rPr>
-      </w:pPr>
-    </w:p>
-    <w:p>
-      <w:pPr>
-        <w:ind w:left="90" w:hanging="90"/>
-        <w:rPr>
-          <w:rFonts w:cstheme="minorHAnsi"/>
-        </w:rPr>
-      </w:pPr>
-      <w:r>
-        <w:rPr>
-          <w:rFonts w:cstheme="minorHAnsi"/>
-          <w:b/>
-          <w:bCs/>
-          <w:sz w:val="28"/>
-          <w:szCs w:val="28"/>
-        </w:rPr>
-        <w:t>CORE COMPETENCIES</w:t>
-      </w:r>
-      <w:r>
-        <w:rPr>
-          <w:rFonts w:cstheme="minorHAnsi"/>
-        </w:rPr>
-        <w:t xml:space="preserve"> </w:t>
-      </w:r>
-    </w:p>
-    <w:p>
-      <w:pPr>
-        <w:ind w:left="90"/>
-        <w:rPr>
-          <w:rFonts w:cstheme="minorHAnsi"/>
-        </w:rPr>
-      </w:pPr>
-      <w:r>
-        <w:rPr>
-          <w:rFonts w:cstheme="minorHAnsi"/>
-        </w:rPr>
-        <w:t>Full Stack Development</w:t>
-      </w:r>
-      <w:r>
-        <w:rPr>
-          <w:rFonts w:cstheme="minorHAnsi"/>
-        </w:rPr>
-        <w:t xml:space="preserve"> </w:t>
-      </w:r>
-      <w:r>
-        <w:rPr>
-          <w:rFonts w:cstheme="minorHAnsi"/>
-        </w:rPr>
-        <w:t>|</w:t>
-      </w:r>
-      <w:r>
-        <w:rPr>
-          <w:rFonts w:cstheme="minorHAnsi"/>
-        </w:rPr>
-        <w:t xml:space="preserve"> Agile Methodology |</w:t>
-      </w:r>
-      <w:r>
-        <w:rPr>
-          <w:rFonts w:cstheme="minorHAnsi"/>
-        </w:rPr>
-        <w:t xml:space="preserve"> </w:t>
-      </w:r>
-      <w:r>
-        <w:rPr>
-          <w:rFonts w:cstheme="minorHAnsi"/>
-        </w:rPr>
-        <w:t>Responsive Web Design | SEO Optimization | Cross-browser Compatibility | Performance</w:t>
-      </w:r>
-      <w:r>
-        <w:rPr>
-          <w:rFonts w:cstheme="minorHAnsi"/>
-        </w:rPr>
-        <w:t xml:space="preserve"> </w:t>
-      </w:r>
-      <w:r>
-        <w:rPr>
-          <w:rFonts w:cstheme="minorHAnsi"/>
-        </w:rPr>
-        <w:t>Tuning</w:t>
-      </w:r>
-    </w:p>
-    <w:p>
-      <w:pPr>
-        <w:ind w:left="90"/>
         <w:rPr>
           <w:rFonts w:cstheme="minorHAnsi"/>
         </w:rPr>
@@ -1690,16 +1501,8 @@
         <w:rPr>
           <w:rFonts w:cstheme="minorHAnsi"/>
         </w:rPr>
-        <w:t xml:space="preserve">Programming Languages: </w:t>
-      </w:r>
-      <w:proofErr w:type="spellStart"/>
-      <w:r>
-        <w:rPr>
-          <w:rFonts w:cstheme="minorHAnsi"/>
-        </w:rPr>
-        <w:t>Javascript</w:t>
-      </w:r>
-      <w:proofErr w:type="spellEnd"/>
+        <w:t>Programming Languages: Javascript</w:t>
+      </w:r>
     </w:p>
     <w:p>
       <w:pPr>
@@ -1734,21 +1537,7 @@
         <w:rPr>
           <w:rFonts w:cstheme="minorHAnsi"/>
         </w:rPr>
-        <w:t xml:space="preserve">Developer Tools: </w:t>
-      </w:r>
-      <w:proofErr w:type="spellStart"/>
-      <w:r>
-        <w:rPr>
-          <w:rFonts w:cstheme="minorHAnsi"/>
-        </w:rPr>
-        <w:t>Github</w:t>
-      </w:r>
-      <w:proofErr w:type="spellEnd"/>
-      <w:r>
-        <w:rPr>
-          <w:rFonts w:cstheme="minorHAnsi"/>
-        </w:rPr>
-        <w:t>, VS Code, Postman</w:t>
+        <w:t>Developer Tools: Github, VS Code, Postman</w:t>
       </w:r>
     </w:p>
     <w:p>
@@ -1808,16 +1597,26 @@
         <w:rPr>
           <w:rFonts w:cstheme="minorHAnsi"/>
         </w:rPr>
-        <w:t xml:space="preserve">ORM and Database: </w:t>
-      </w:r>
-      <w:proofErr w:type="spellStart"/>
-      <w:r>
-        <w:rPr>
-          <w:rFonts w:cstheme="minorHAnsi"/>
-        </w:rPr>
-        <w:t>MongoDb</w:t>
-      </w:r>
-      <w:proofErr w:type="spellEnd"/>
+        <w:t>Search Engine Optimization (SEO)</w:t>
+      </w:r>
+    </w:p>
+    <w:p>
+      <w:pPr>
+        <w:pStyle w:val="ListParagraph"/>
+        <w:numPr>
+          <w:ilvl w:val="0"/>
+          <w:numId w:val="12"/>
+        </w:numPr>
+        <w:rPr>
+          <w:rFonts w:cstheme="minorHAnsi"/>
+        </w:rPr>
+      </w:pPr>
+      <w:r>
+        <w:rPr>
+          <w:rFonts w:cstheme="minorHAnsi"/>
+        </w:rPr>
+        <w:t>ORM and Database: MongoDb</w:t>
+      </w:r>
     </w:p>
     <w:p>
       <w:pPr>
@@ -1943,21 +1742,7 @@
         <w:rPr>
           <w:rFonts w:cstheme="minorHAnsi"/>
         </w:rPr>
-        <w:t xml:space="preserve">+ projects on GitHub Pages and </w:t>
-      </w:r>
-      <w:proofErr w:type="spellStart"/>
-      <w:r>
-        <w:rPr>
-          <w:rFonts w:cstheme="minorHAnsi"/>
-        </w:rPr>
-        <w:t>Vercel</w:t>
-      </w:r>
-      <w:proofErr w:type="spellEnd"/>
-      <w:r>
-        <w:rPr>
-          <w:rFonts w:cstheme="minorHAnsi"/>
-        </w:rPr>
-        <w:t>, enabling real-time previews and faster feedback cycles.</w:t>
+        <w:t>+ projects on GitHub Pages and Vercel, enabling real-time previews and faster feedback cycles.</w:t>
       </w:r>
     </w:p>
     <w:p>
@@ -1974,133 +1759,6 @@
         <w:pict w14:anchorId="51A8317C">
           <v:rect id="_x0000_i1033" style="width:0;height:1.5pt" o:hralign="center" o:hrstd="t" o:hr="t" fillcolor="#a0a0a0" stroked="f"/>
         </w:pict>
-      </w:r>
-    </w:p>
-    <w:p>
-      <w:pPr>
-        <w:ind w:left="90" w:hanging="90"/>
-        <w:rPr>
-          <w:rFonts w:cstheme="minorHAnsi"/>
-          <w:b/>
-          <w:bCs/>
-          <w:sz w:val="28"/>
-          <w:szCs w:val="28"/>
-        </w:rPr>
-      </w:pPr>
-      <w:r>
-        <w:rPr>
-          <w:rFonts w:cstheme="minorHAnsi"/>
-          <w:b/>
-          <w:bCs/>
-          <w:sz w:val="28"/>
-          <w:szCs w:val="28"/>
-        </w:rPr>
-        <w:t>ADDITIONAL QUALIFICATIONS</w:t>
-      </w:r>
-    </w:p>
-    <w:p>
-      <w:pPr>
-        <w:pStyle w:val="ListParagraph"/>
-        <w:numPr>
-          <w:ilvl w:val="0"/>
-          <w:numId w:val="5"/>
-        </w:numPr>
-        <w:ind w:left="90" w:hanging="90"/>
-        <w:rPr>
-          <w:rFonts w:cstheme="minorHAnsi"/>
-          <w:b/>
-          <w:bCs/>
-          <w:sz w:val="28"/>
-          <w:szCs w:val="28"/>
-        </w:rPr>
-      </w:pPr>
-      <w:r>
-        <w:rPr>
-          <w:rFonts w:cstheme="minorHAnsi"/>
-        </w:rPr>
-        <w:t>Strong understanding of on-page SEO and performance metrics.</w:t>
-      </w:r>
-    </w:p>
-    <w:p>
-      <w:pPr>
-        <w:pStyle w:val="ListParagraph"/>
-        <w:numPr>
-          <w:ilvl w:val="0"/>
-          <w:numId w:val="5"/>
-        </w:numPr>
-        <w:ind w:left="90" w:hanging="90"/>
-        <w:rPr>
-          <w:rFonts w:cstheme="minorHAnsi"/>
-          <w:b/>
-          <w:bCs/>
-          <w:sz w:val="28"/>
-          <w:szCs w:val="28"/>
-        </w:rPr>
-      </w:pPr>
-      <w:r>
-        <w:rPr>
-          <w:rFonts w:cstheme="minorHAnsi"/>
-        </w:rPr>
-        <w:t xml:space="preserve">Familiar with deploying static sites using </w:t>
-      </w:r>
-      <w:proofErr w:type="spellStart"/>
-      <w:r>
-        <w:rPr>
-          <w:rFonts w:cstheme="minorHAnsi"/>
-        </w:rPr>
-        <w:t>Vercel</w:t>
-      </w:r>
-      <w:proofErr w:type="spellEnd"/>
-      <w:r>
-        <w:rPr>
-          <w:rFonts w:cstheme="minorHAnsi"/>
-        </w:rPr>
-        <w:t xml:space="preserve"> &amp; Netlify.</w:t>
-      </w:r>
-    </w:p>
-    <w:p>
-      <w:pPr>
-        <w:pStyle w:val="ListParagraph"/>
-        <w:numPr>
-          <w:ilvl w:val="0"/>
-          <w:numId w:val="5"/>
-        </w:numPr>
-        <w:ind w:left="90" w:hanging="90"/>
-        <w:rPr>
-          <w:rFonts w:cstheme="minorHAnsi"/>
-        </w:rPr>
-      </w:pPr>
-      <w:r>
-        <w:rPr>
-          <w:rFonts w:cstheme="minorHAnsi"/>
-        </w:rPr>
-        <w:lastRenderedPageBreak/>
-        <w:t>Enthusiastic about learning new frontend technologies and frameworks.</w:t>
-      </w:r>
-    </w:p>
-    <w:p>
-      <w:pPr>
-        <w:pStyle w:val="ListParagraph"/>
-        <w:numPr>
-          <w:ilvl w:val="0"/>
-          <w:numId w:val="5"/>
-        </w:numPr>
-        <w:ind w:left="90" w:hanging="90"/>
-        <w:rPr>
-          <w:rFonts w:cstheme="minorHAnsi"/>
-        </w:rPr>
-      </w:pPr>
-      <w:r>
-        <w:rPr>
-          <w:rFonts w:cstheme="minorHAnsi"/>
-        </w:rPr>
-        <w:t>Attention to detail with a focus on accessibility and responsive design</w:t>
-      </w:r>
-      <w:r>
-        <w:rPr>
-          <w:rFonts w:cstheme="minorHAnsi"/>
-        </w:rPr>
-        <w:t>.</w:t>
       </w:r>
     </w:p>
     <w:p>

</xml_diff>